<commit_message>
Proposal Updated, 2way Multisim File added
</commit_message>
<xml_diff>
--- a/DLD Project Proposal.docx
+++ b/DLD Project Proposal.docx
@@ -1,6 +1,6 @@
 
 <file path=word/document.xml><?xml version="1.0" encoding="utf-8"?>
-<w:document xmlns:wpc="http://schemas.microsoft.com/office/word/2010/wordprocessingCanvas" xmlns:cx="http://schemas.microsoft.com/office/drawing/2014/chartex" xmlns:cx1="http://schemas.microsoft.com/office/drawing/2015/9/8/chartex" xmlns:cx2="http://schemas.microsoft.com/office/drawing/2015/10/21/chartex" xmlns:cx3="http://schemas.microsoft.com/office/drawing/2016/5/9/chartex" xmlns:cx4="http://schemas.microsoft.com/office/drawing/2016/5/10/chartex" xmlns:cx5="http://schemas.microsoft.com/office/drawing/2016/5/11/chartex" xmlns:cx6="http://schemas.microsoft.com/office/drawing/2016/5/12/chartex" xmlns:cx7="http://schemas.microsoft.com/office/drawing/2016/5/13/chartex" xmlns:cx8="http://schemas.microsoft.com/office/drawing/2016/5/14/chartex" xmlns:mc="http://schemas.openxmlformats.org/markup-compatibility/2006" xmlns:aink="http://schemas.microsoft.com/office/drawing/2016/ink" xmlns:am3d="http://schemas.microsoft.com/office/drawing/2017/model3d" xmlns:o="urn:schemas-microsoft-com:office:office" xmlns:oel="http://schemas.microsoft.com/office/2019/extlst" xmlns:r="http://schemas.openxmlformats.org/officeDocument/2006/relationships" xmlns:m="http://schemas.openxmlformats.org/officeDocument/2006/math" xmlns:v="urn:schemas-microsoft-com:vml" xmlns:wp14="http://schemas.microsoft.com/office/word/2010/wordprocessingDrawing" xmlns:wp="http://schemas.openxmlformats.org/drawingml/2006/wordprocessingDrawing" xmlns:w10="urn:schemas-microsoft-com:office:word" xmlns:w="http://schemas.openxmlformats.org/wordprocessingml/2006/main" xmlns:w14="http://schemas.microsoft.com/office/word/2010/wordml" xmlns:w15="http://schemas.microsoft.com/office/word/2012/wordml" xmlns:w16cex="http://schemas.microsoft.com/office/word/2018/wordml/cex" xmlns:w16cid="http://schemas.microsoft.com/office/word/2016/wordml/cid" xmlns:w16="http://schemas.microsoft.com/office/word/2018/wordml" xmlns:w16sdtdh="http://schemas.microsoft.com/office/word/2020/wordml/sdtdatahash" xmlns:w16se="http://schemas.microsoft.com/office/word/2015/wordml/symex" xmlns:wpg="http://schemas.microsoft.com/office/word/2010/wordprocessingGroup" xmlns:wpi="http://schemas.microsoft.com/office/word/2010/wordprocessingInk" xmlns:wne="http://schemas.microsoft.com/office/word/2006/wordml" xmlns:wps="http://schemas.microsoft.com/office/word/2010/wordprocessingShape" mc:Ignorable="w14 w15 w16se w16cid w16 w16cex w16sdtdh wp14">
+<w:document xmlns:wpc="http://schemas.microsoft.com/office/word/2010/wordprocessingCanvas" xmlns:cx="http://schemas.microsoft.com/office/drawing/2014/chartex" xmlns:cx1="http://schemas.microsoft.com/office/drawing/2015/9/8/chartex" xmlns:cx2="http://schemas.microsoft.com/office/drawing/2015/10/21/chartex" xmlns:cx3="http://schemas.microsoft.com/office/drawing/2016/5/9/chartex" xmlns:cx4="http://schemas.microsoft.com/office/drawing/2016/5/10/chartex" xmlns:cx5="http://schemas.microsoft.com/office/drawing/2016/5/11/chartex" xmlns:cx6="http://schemas.microsoft.com/office/drawing/2016/5/12/chartex" xmlns:cx7="http://schemas.microsoft.com/office/drawing/2016/5/13/chartex" xmlns:cx8="http://schemas.microsoft.com/office/drawing/2016/5/14/chartex" xmlns:mc="http://schemas.openxmlformats.org/markup-compatibility/2006" xmlns:aink="http://schemas.microsoft.com/office/drawing/2016/ink" xmlns:am3d="http://schemas.microsoft.com/office/drawing/2017/model3d" xmlns:o="urn:schemas-microsoft-com:office:office" xmlns:oel="http://schemas.microsoft.com/office/2019/extlst" xmlns:r="http://schemas.openxmlformats.org/officeDocument/2006/relationships" xmlns:m="http://schemas.openxmlformats.org/officeDocument/2006/math" xmlns:v="urn:schemas-microsoft-com:vml" xmlns:wp14="http://schemas.microsoft.com/office/word/2010/wordprocessingDrawing" xmlns:wp="http://schemas.openxmlformats.org/drawingml/2006/wordprocessingDrawing" xmlns:w10="urn:schemas-microsoft-com:office:word" xmlns:w="http://schemas.openxmlformats.org/wordprocessingml/2006/main" xmlns:w14="http://schemas.microsoft.com/office/word/2010/wordml" xmlns:w15="http://schemas.microsoft.com/office/word/2012/wordml" xmlns:w16cex="http://schemas.microsoft.com/office/word/2018/wordml/cex" xmlns:w16cid="http://schemas.microsoft.com/office/word/2016/wordml/cid" xmlns:w16="http://schemas.microsoft.com/office/word/2018/wordml" xmlns:w16du="http://schemas.microsoft.com/office/word/2023/wordml/word16du" xmlns:w16sdtdh="http://schemas.microsoft.com/office/word/2020/wordml/sdtdatahash" xmlns:w16sdtfl="http://schemas.microsoft.com/office/word/2024/wordml/sdtformatlock" xmlns:w16se="http://schemas.microsoft.com/office/word/2015/wordml/symex" xmlns:wpg="http://schemas.microsoft.com/office/word/2010/wordprocessingGroup" xmlns:wpi="http://schemas.microsoft.com/office/word/2010/wordprocessingInk" xmlns:wne="http://schemas.microsoft.com/office/word/2006/wordml" xmlns:wps="http://schemas.microsoft.com/office/word/2010/wordprocessingShape" mc:Ignorable="w14 w15 w16se w16cid w16 w16cex w16sdtdh w16sdtfl w16du wp14">
   <w:body>
     <w:p>
       <w:pPr>
@@ -72,7 +72,7 @@
                     <pic:cNvPicPr/>
                   </pic:nvPicPr>
                   <pic:blipFill>
-                    <a:blip r:embed="rId5">
+                    <a:blip r:embed="rId6">
                       <a:extLst>
                         <a:ext uri="{28A0092B-C50C-407E-A947-70E740481C1C}">
                           <a14:useLocalDpi xmlns:a14="http://schemas.microsoft.com/office/drawing/2010/main" val="0"/>
@@ -121,7 +121,6 @@
     </w:p>
     <w:p>
       <w:pPr>
-        <w:pStyle w:val="Title"/>
         <w:jc w:val="center"/>
         <w:rPr>
           <w:rFonts w:ascii="Times New Roman" w:hAnsi="Times New Roman"/>
@@ -135,19 +134,19 @@
         <w:rPr>
           <w:rStyle w:val="Strong"/>
           <w:rFonts w:ascii="Times New Roman" w:hAnsi="Times New Roman"/>
+          <w:sz w:val="44"/>
+          <w:szCs w:val="44"/>
+        </w:rPr>
+        <w:t xml:space="preserve">2-Way </w:t>
+      </w:r>
+      <w:r>
+        <w:rPr>
+          <w:rStyle w:val="Strong"/>
+          <w:rFonts w:ascii="Times New Roman" w:hAnsi="Times New Roman"/>
           <w:sz w:val="48"/>
           <w:szCs w:val="48"/>
         </w:rPr>
-        <w:t>Automated</w:t>
-      </w:r>
-      <w:r>
-        <w:rPr>
-          <w:rStyle w:val="Strong"/>
-          <w:rFonts w:ascii="Times New Roman" w:hAnsi="Times New Roman"/>
-          <w:sz w:val="48"/>
-          <w:szCs w:val="48"/>
-        </w:rPr>
-        <w:t xml:space="preserve"> Traffic Light Control System</w:t>
+        <w:t>Traffic Light Control System</w:t>
       </w:r>
     </w:p>
     <w:p>
@@ -321,7 +320,6 @@
           <w:sz w:val="36"/>
           <w:szCs w:val="36"/>
         </w:rPr>
-        <w:lastRenderedPageBreak/>
         <w:t xml:space="preserve">ABSTRACT: </w:t>
       </w:r>
     </w:p>
@@ -339,32 +337,162 @@
           <w:sz w:val="32"/>
           <w:szCs w:val="32"/>
         </w:rPr>
-        <w:t xml:space="preserve">This lab project involves </w:t>
-      </w:r>
-      <w:r>
-        <w:rPr>
-          <w:rFonts w:ascii="Times New Roman" w:hAnsi="Times New Roman"/>
-          <w:sz w:val="32"/>
-          <w:szCs w:val="32"/>
-        </w:rPr>
-        <w:t>designing</w:t>
-      </w:r>
-      <w:r>
-        <w:rPr>
-          <w:rFonts w:ascii="Times New Roman" w:hAnsi="Times New Roman"/>
-          <w:sz w:val="32"/>
-          <w:szCs w:val="32"/>
-        </w:rPr>
-        <w:t xml:space="preserve"> and </w:t>
-      </w:r>
-      <w:r>
-        <w:rPr>
-          <w:rFonts w:ascii="Times New Roman" w:hAnsi="Times New Roman"/>
-          <w:sz w:val="32"/>
-          <w:szCs w:val="32"/>
-        </w:rPr>
-        <w:t>implementing</w:t>
-      </w:r>
+        <w:t xml:space="preserve">This lab project involves designing and implementing a low-cost, automated Traffic Light Control System that </w:t>
+      </w:r>
+      <w:r>
+        <w:rPr>
+          <w:rFonts w:ascii="Times New Roman" w:hAnsi="Times New Roman"/>
+          <w:sz w:val="32"/>
+          <w:szCs w:val="32"/>
+        </w:rPr>
+        <w:t>displays</w:t>
+      </w:r>
+      <w:r>
+        <w:rPr>
+          <w:rFonts w:ascii="Times New Roman" w:hAnsi="Times New Roman"/>
+          <w:sz w:val="32"/>
+          <w:szCs w:val="32"/>
+        </w:rPr>
+        <w:t xml:space="preserve"> a real-world, two-way road intersection using digital logic components. A 555 Timer </w:t>
+      </w:r>
+      <w:r>
+        <w:rPr>
+          <w:rFonts w:ascii="Times New Roman" w:hAnsi="Times New Roman"/>
+          <w:sz w:val="32"/>
+          <w:szCs w:val="32"/>
+        </w:rPr>
+        <w:t xml:space="preserve">IC is used to generate </w:t>
+      </w:r>
+      <w:r>
+        <w:rPr>
+          <w:rFonts w:ascii="Times New Roman" w:hAnsi="Times New Roman"/>
+          <w:sz w:val="32"/>
+          <w:szCs w:val="32"/>
+        </w:rPr>
+        <w:t xml:space="preserve">continuous clock pulses, </w:t>
+      </w:r>
+      <w:r>
+        <w:rPr>
+          <w:rFonts w:ascii="Times New Roman" w:hAnsi="Times New Roman"/>
+          <w:sz w:val="32"/>
+          <w:szCs w:val="32"/>
+        </w:rPr>
+        <w:t xml:space="preserve">which </w:t>
+      </w:r>
+      <w:r>
+        <w:rPr>
+          <w:rFonts w:ascii="Times New Roman" w:hAnsi="Times New Roman"/>
+          <w:sz w:val="32"/>
+          <w:szCs w:val="32"/>
+        </w:rPr>
+        <w:t>allow</w:t>
+      </w:r>
+      <w:r>
+        <w:rPr>
+          <w:rFonts w:ascii="Times New Roman" w:hAnsi="Times New Roman"/>
+          <w:sz w:val="32"/>
+          <w:szCs w:val="32"/>
+        </w:rPr>
+        <w:t>s</w:t>
+      </w:r>
+      <w:r>
+        <w:rPr>
+          <w:rFonts w:ascii="Times New Roman" w:hAnsi="Times New Roman"/>
+          <w:sz w:val="32"/>
+          <w:szCs w:val="32"/>
+        </w:rPr>
+        <w:t xml:space="preserve"> the </w:t>
+      </w:r>
+      <w:r>
+        <w:rPr>
+          <w:rFonts w:ascii="Times New Roman" w:hAnsi="Times New Roman"/>
+          <w:sz w:val="32"/>
+          <w:szCs w:val="32"/>
+        </w:rPr>
+        <w:t>CD4017-decade</w:t>
+      </w:r>
+      <w:r>
+        <w:rPr>
+          <w:rFonts w:ascii="Times New Roman" w:hAnsi="Times New Roman"/>
+          <w:sz w:val="32"/>
+          <w:szCs w:val="32"/>
+        </w:rPr>
+        <w:t xml:space="preserve"> counter</w:t>
+      </w:r>
+      <w:r>
+        <w:rPr>
+          <w:rFonts w:ascii="Times New Roman" w:hAnsi="Times New Roman"/>
+          <w:sz w:val="32"/>
+          <w:szCs w:val="32"/>
+        </w:rPr>
+        <w:t xml:space="preserve"> to work in a </w:t>
+      </w:r>
+      <w:r>
+        <w:rPr>
+          <w:rFonts w:ascii="Times New Roman" w:hAnsi="Times New Roman"/>
+          <w:sz w:val="32"/>
+          <w:szCs w:val="32"/>
+        </w:rPr>
+        <w:t>sequential manner</w:t>
+      </w:r>
+      <w:r>
+        <w:rPr>
+          <w:rFonts w:ascii="Times New Roman" w:hAnsi="Times New Roman"/>
+          <w:sz w:val="32"/>
+          <w:szCs w:val="32"/>
+        </w:rPr>
+        <w:t xml:space="preserve"> for red, yellow and green light</w:t>
+      </w:r>
+      <w:r>
+        <w:rPr>
+          <w:rFonts w:ascii="Times New Roman" w:hAnsi="Times New Roman"/>
+          <w:sz w:val="32"/>
+          <w:szCs w:val="32"/>
+        </w:rPr>
+        <w:t xml:space="preserve">. The two roads are </w:t>
+      </w:r>
+      <w:r>
+        <w:rPr>
+          <w:rFonts w:ascii="Times New Roman" w:hAnsi="Times New Roman"/>
+          <w:sz w:val="32"/>
+          <w:szCs w:val="32"/>
+        </w:rPr>
+        <w:t>positioned</w:t>
+      </w:r>
+      <w:r>
+        <w:rPr>
+          <w:rFonts w:ascii="Times New Roman" w:hAnsi="Times New Roman"/>
+          <w:sz w:val="32"/>
+          <w:szCs w:val="32"/>
+        </w:rPr>
+        <w:t xml:space="preserve"> to be in opposite states</w:t>
+      </w:r>
+      <w:r>
+        <w:rPr>
+          <w:rFonts w:ascii="Times New Roman" w:hAnsi="Times New Roman"/>
+          <w:sz w:val="32"/>
+          <w:szCs w:val="32"/>
+        </w:rPr>
+        <w:t xml:space="preserve"> always,</w:t>
+      </w:r>
+      <w:r>
+        <w:rPr>
+          <w:rFonts w:ascii="Times New Roman" w:hAnsi="Times New Roman"/>
+          <w:sz w:val="32"/>
+          <w:szCs w:val="32"/>
+        </w:rPr>
+        <w:t xml:space="preserve"> when one road's </w:t>
+      </w:r>
+      <w:proofErr w:type="gramStart"/>
+      <w:r>
+        <w:rPr>
+          <w:rFonts w:ascii="Times New Roman" w:hAnsi="Times New Roman"/>
+          <w:sz w:val="32"/>
+          <w:szCs w:val="32"/>
+        </w:rPr>
+        <w:t>Red</w:t>
+      </w:r>
+      <w:proofErr w:type="gramEnd"/>
       <w:r>
         <w:rPr>
           <w:rFonts w:ascii="Times New Roman" w:hAnsi="Times New Roman"/>
@@ -379,24 +507,75 @@
           <w:sz w:val="32"/>
           <w:szCs w:val="32"/>
         </w:rPr>
-        <w:t xml:space="preserve">a low cost, </w:t>
-      </w:r>
-      <w:r>
-        <w:rPr>
-          <w:rFonts w:ascii="Times New Roman" w:hAnsi="Times New Roman"/>
-          <w:sz w:val="32"/>
-          <w:szCs w:val="32"/>
-        </w:rPr>
-        <w:t>an</w:t>
-      </w:r>
-      <w:r>
-        <w:rPr>
-          <w:rFonts w:ascii="Times New Roman" w:hAnsi="Times New Roman"/>
-          <w:sz w:val="32"/>
-          <w:szCs w:val="32"/>
-        </w:rPr>
-        <w:t>d</w:t>
-      </w:r>
+        <w:t xml:space="preserve">light </w:t>
+      </w:r>
+      <w:r>
+        <w:rPr>
+          <w:rFonts w:ascii="Times New Roman" w:hAnsi="Times New Roman"/>
+          <w:sz w:val="32"/>
+          <w:szCs w:val="32"/>
+        </w:rPr>
+        <w:t>is ON, the other's Green is ON</w:t>
+      </w:r>
+      <w:r>
+        <w:rPr>
+          <w:rFonts w:ascii="Times New Roman" w:hAnsi="Times New Roman"/>
+          <w:sz w:val="32"/>
+          <w:szCs w:val="32"/>
+        </w:rPr>
+        <w:t xml:space="preserve">, </w:t>
+      </w:r>
+      <w:r>
+        <w:rPr>
+          <w:rFonts w:ascii="Times New Roman" w:hAnsi="Times New Roman"/>
+          <w:sz w:val="32"/>
+          <w:szCs w:val="32"/>
+        </w:rPr>
+        <w:t xml:space="preserve">allowing </w:t>
+      </w:r>
+      <w:r>
+        <w:rPr>
+          <w:rFonts w:ascii="Times New Roman" w:hAnsi="Times New Roman"/>
+          <w:sz w:val="32"/>
+          <w:szCs w:val="32"/>
+        </w:rPr>
+        <w:t xml:space="preserve">a </w:t>
+      </w:r>
+      <w:r>
+        <w:rPr>
+          <w:rFonts w:ascii="Times New Roman" w:hAnsi="Times New Roman"/>
+          <w:sz w:val="32"/>
+          <w:szCs w:val="32"/>
+        </w:rPr>
+        <w:t>safe, alternating traffic flow using a single control circuit.</w:t>
+      </w:r>
+    </w:p>
+    <w:p>
+      <w:pPr>
+        <w:rPr>
+          <w:rFonts w:ascii="Times New Roman" w:hAnsi="Times New Roman"/>
+          <w:sz w:val="32"/>
+          <w:szCs w:val="32"/>
+        </w:rPr>
+      </w:pPr>
+      <w:r>
+        <w:rPr>
+          <w:rFonts w:ascii="Times New Roman" w:hAnsi="Times New Roman"/>
+          <w:sz w:val="32"/>
+          <w:szCs w:val="32"/>
+        </w:rPr>
+        <w:t xml:space="preserve">A 74LS192 counter and CD4511 decoder </w:t>
+      </w:r>
+      <w:proofErr w:type="gramStart"/>
+      <w:r>
+        <w:rPr>
+          <w:rFonts w:ascii="Times New Roman" w:hAnsi="Times New Roman"/>
+          <w:sz w:val="32"/>
+          <w:szCs w:val="32"/>
+        </w:rPr>
+        <w:t>allows</w:t>
+      </w:r>
+      <w:proofErr w:type="gramEnd"/>
       <w:r>
         <w:rPr>
           <w:rFonts w:ascii="Times New Roman" w:hAnsi="Times New Roman"/>
@@ -411,83 +590,103 @@
           <w:sz w:val="32"/>
           <w:szCs w:val="32"/>
         </w:rPr>
-        <w:t>a</w:t>
-      </w:r>
-      <w:r>
-        <w:rPr>
-          <w:rFonts w:ascii="Times New Roman" w:hAnsi="Times New Roman"/>
-          <w:sz w:val="32"/>
-          <w:szCs w:val="32"/>
-        </w:rPr>
-        <w:t>utomated</w:t>
-      </w:r>
-      <w:r>
-        <w:rPr>
-          <w:rFonts w:ascii="Times New Roman" w:hAnsi="Times New Roman"/>
-          <w:b/>
-          <w:bCs/>
-          <w:sz w:val="32"/>
-          <w:szCs w:val="32"/>
-        </w:rPr>
-        <w:t xml:space="preserve"> </w:t>
-      </w:r>
-      <w:r>
-        <w:rPr>
-          <w:rFonts w:ascii="Times New Roman" w:hAnsi="Times New Roman"/>
-          <w:b/>
-          <w:bCs/>
-          <w:sz w:val="32"/>
-          <w:szCs w:val="32"/>
-        </w:rPr>
-        <w:t>Traffic Light Control System</w:t>
-      </w:r>
-      <w:r>
-        <w:rPr>
-          <w:rFonts w:ascii="Times New Roman" w:hAnsi="Times New Roman"/>
-          <w:sz w:val="32"/>
-          <w:szCs w:val="32"/>
-        </w:rPr>
-        <w:t xml:space="preserve"> to simulate real world traffic </w:t>
-      </w:r>
-      <w:r>
-        <w:rPr>
-          <w:rFonts w:ascii="Times New Roman" w:hAnsi="Times New Roman"/>
-          <w:sz w:val="32"/>
-          <w:szCs w:val="32"/>
-        </w:rPr>
-        <w:t>light sequence</w:t>
-      </w:r>
-      <w:r>
-        <w:rPr>
-          <w:rFonts w:ascii="Times New Roman" w:hAnsi="Times New Roman"/>
-          <w:sz w:val="32"/>
-          <w:szCs w:val="32"/>
-        </w:rPr>
-        <w:t xml:space="preserve">, using different logic components. The </w:t>
-      </w:r>
-      <w:r>
-        <w:rPr>
-          <w:rFonts w:ascii="Times New Roman" w:hAnsi="Times New Roman"/>
-          <w:sz w:val="32"/>
-          <w:szCs w:val="32"/>
-        </w:rPr>
-        <w:t xml:space="preserve">project </w:t>
-      </w:r>
-      <w:r>
-        <w:rPr>
-          <w:rFonts w:ascii="Times New Roman" w:hAnsi="Times New Roman"/>
-          <w:sz w:val="32"/>
-          <w:szCs w:val="32"/>
-        </w:rPr>
-        <w:t>operates</w:t>
-      </w:r>
-      <w:r>
-        <w:rPr>
-          <w:rFonts w:ascii="Times New Roman" w:hAnsi="Times New Roman"/>
-          <w:sz w:val="32"/>
-          <w:szCs w:val="32"/>
-        </w:rPr>
-        <w:t xml:space="preserve"> by </w:t>
+        <w:t>a 7-segment display t</w:t>
+      </w:r>
+      <w:r>
+        <w:rPr>
+          <w:rFonts w:ascii="Times New Roman" w:hAnsi="Times New Roman"/>
+          <w:sz w:val="32"/>
+          <w:szCs w:val="32"/>
+        </w:rPr>
+        <w:t>o</w:t>
+      </w:r>
+      <w:r>
+        <w:rPr>
+          <w:rFonts w:ascii="Times New Roman" w:hAnsi="Times New Roman"/>
+          <w:sz w:val="32"/>
+          <w:szCs w:val="32"/>
+        </w:rPr>
+        <w:t xml:space="preserve"> coun</w:t>
+      </w:r>
+      <w:r>
+        <w:rPr>
+          <w:rFonts w:ascii="Times New Roman" w:hAnsi="Times New Roman"/>
+          <w:sz w:val="32"/>
+          <w:szCs w:val="32"/>
+        </w:rPr>
+        <w:t>t</w:t>
+      </w:r>
+      <w:r>
+        <w:rPr>
+          <w:rFonts w:ascii="Times New Roman" w:hAnsi="Times New Roman"/>
+          <w:sz w:val="32"/>
+          <w:szCs w:val="32"/>
+        </w:rPr>
+        <w:t xml:space="preserve"> for </w:t>
+      </w:r>
+      <w:r>
+        <w:rPr>
+          <w:rFonts w:ascii="Times New Roman" w:hAnsi="Times New Roman"/>
+          <w:sz w:val="32"/>
+          <w:szCs w:val="32"/>
+        </w:rPr>
+        <w:t xml:space="preserve">almost </w:t>
+      </w:r>
+      <w:r>
+        <w:rPr>
+          <w:rFonts w:ascii="Times New Roman" w:hAnsi="Times New Roman"/>
+          <w:sz w:val="32"/>
+          <w:szCs w:val="32"/>
+        </w:rPr>
+        <w:t xml:space="preserve">3 seconds per light, completing one </w:t>
+      </w:r>
+      <w:r>
+        <w:rPr>
+          <w:rFonts w:ascii="Times New Roman" w:hAnsi="Times New Roman"/>
+          <w:sz w:val="32"/>
+          <w:szCs w:val="32"/>
+        </w:rPr>
+        <w:t>9</w:t>
+      </w:r>
+      <w:r>
+        <w:rPr>
+          <w:rFonts w:ascii="Times New Roman" w:hAnsi="Times New Roman"/>
+          <w:sz w:val="32"/>
+          <w:szCs w:val="32"/>
+        </w:rPr>
+        <w:t xml:space="preserve">-second cycle before restarting, </w:t>
+      </w:r>
+      <w:r>
+        <w:rPr>
+          <w:rFonts w:ascii="Times New Roman" w:hAnsi="Times New Roman"/>
+          <w:sz w:val="32"/>
+          <w:szCs w:val="32"/>
+        </w:rPr>
+        <w:t xml:space="preserve">which gives </w:t>
+      </w:r>
+      <w:r>
+        <w:rPr>
+          <w:rFonts w:ascii="Times New Roman" w:hAnsi="Times New Roman"/>
+          <w:sz w:val="32"/>
+          <w:szCs w:val="32"/>
+        </w:rPr>
+        <w:t xml:space="preserve">a clear numeric </w:t>
+      </w:r>
+      <w:r>
+        <w:rPr>
+          <w:rFonts w:ascii="Times New Roman" w:hAnsi="Times New Roman"/>
+          <w:sz w:val="32"/>
+          <w:szCs w:val="32"/>
+        </w:rPr>
+        <w:t xml:space="preserve">hint </w:t>
+      </w:r>
+      <w:r>
+        <w:rPr>
+          <w:rFonts w:ascii="Times New Roman" w:hAnsi="Times New Roman"/>
+          <w:sz w:val="32"/>
+          <w:szCs w:val="32"/>
+        </w:rPr>
+        <w:t xml:space="preserve">of the time left before the signal changes. The project ensures </w:t>
       </w:r>
       <w:r>
         <w:rPr>
@@ -500,216 +699,42 @@
       <w:r>
         <w:rPr>
           <w:rFonts w:ascii="Times New Roman" w:hAnsi="Times New Roman"/>
-          <w:b/>
-          <w:bCs/>
-          <w:sz w:val="32"/>
-          <w:szCs w:val="32"/>
-        </w:rPr>
-        <w:t>555 Timer IC</w:t>
-      </w:r>
-      <w:r>
-        <w:rPr>
-          <w:rFonts w:ascii="Times New Roman" w:hAnsi="Times New Roman"/>
-          <w:sz w:val="32"/>
-          <w:szCs w:val="32"/>
-        </w:rPr>
-        <w:t xml:space="preserve"> to generate a clock pulse and </w:t>
-      </w:r>
-      <w:r>
-        <w:rPr>
-          <w:rFonts w:ascii="Times New Roman" w:hAnsi="Times New Roman"/>
-          <w:b/>
-          <w:bCs/>
-          <w:sz w:val="32"/>
-          <w:szCs w:val="32"/>
-        </w:rPr>
-        <w:t>CD</w:t>
-      </w:r>
-      <w:r>
-        <w:rPr>
-          <w:rFonts w:ascii="Times New Roman" w:hAnsi="Times New Roman"/>
-          <w:b/>
-          <w:bCs/>
-          <w:sz w:val="32"/>
-          <w:szCs w:val="32"/>
-        </w:rPr>
-        <w:t>4017</w:t>
-      </w:r>
-      <w:r>
-        <w:rPr>
-          <w:rFonts w:ascii="Times New Roman" w:hAnsi="Times New Roman"/>
-          <w:sz w:val="32"/>
-          <w:szCs w:val="32"/>
-        </w:rPr>
-        <w:t>, a d</w:t>
-      </w:r>
-      <w:r>
-        <w:rPr>
-          <w:rFonts w:ascii="Times New Roman" w:hAnsi="Times New Roman"/>
-          <w:sz w:val="32"/>
-          <w:szCs w:val="32"/>
-        </w:rPr>
-        <w:t xml:space="preserve">ecade </w:t>
-      </w:r>
-      <w:r>
-        <w:rPr>
-          <w:rFonts w:ascii="Times New Roman" w:hAnsi="Times New Roman"/>
-          <w:sz w:val="32"/>
-          <w:szCs w:val="32"/>
-        </w:rPr>
-        <w:t>c</w:t>
-      </w:r>
-      <w:r>
-        <w:rPr>
-          <w:rFonts w:ascii="Times New Roman" w:hAnsi="Times New Roman"/>
-          <w:sz w:val="32"/>
-          <w:szCs w:val="32"/>
-        </w:rPr>
-        <w:t>ounter</w:t>
-      </w:r>
-      <w:r>
-        <w:rPr>
-          <w:rFonts w:ascii="Times New Roman" w:hAnsi="Times New Roman"/>
-          <w:sz w:val="32"/>
-          <w:szCs w:val="32"/>
-        </w:rPr>
-        <w:t>,</w:t>
-      </w:r>
-      <w:r>
-        <w:rPr>
-          <w:rFonts w:ascii="Times New Roman" w:hAnsi="Times New Roman"/>
-          <w:sz w:val="32"/>
-          <w:szCs w:val="32"/>
-        </w:rPr>
-        <w:t xml:space="preserve"> to manage the timely switching of traffic signals</w:t>
-      </w:r>
-      <w:r>
-        <w:rPr>
-          <w:rFonts w:ascii="Times New Roman" w:hAnsi="Times New Roman"/>
-          <w:sz w:val="32"/>
-          <w:szCs w:val="32"/>
-        </w:rPr>
-        <w:t>.</w:t>
-      </w:r>
-      <w:r>
-        <w:rPr>
-          <w:rFonts w:ascii="Times New Roman" w:hAnsi="Times New Roman"/>
-          <w:sz w:val="32"/>
-          <w:szCs w:val="32"/>
-        </w:rPr>
-        <w:t xml:space="preserve"> </w:t>
-      </w:r>
-      <w:r>
-        <w:rPr>
-          <w:rFonts w:ascii="Times New Roman" w:hAnsi="Times New Roman"/>
-          <w:sz w:val="32"/>
-          <w:szCs w:val="32"/>
-        </w:rPr>
-        <w:t>T</w:t>
-      </w:r>
-      <w:r>
-        <w:rPr>
-          <w:rFonts w:ascii="Times New Roman" w:hAnsi="Times New Roman"/>
-          <w:sz w:val="32"/>
-          <w:szCs w:val="32"/>
-        </w:rPr>
-        <w:t xml:space="preserve">he 555 </w:t>
-      </w:r>
-      <w:r>
-        <w:rPr>
-          <w:rFonts w:ascii="Times New Roman" w:hAnsi="Times New Roman"/>
-          <w:sz w:val="32"/>
-          <w:szCs w:val="32"/>
-        </w:rPr>
-        <w:t xml:space="preserve">timer IC </w:t>
-      </w:r>
-      <w:r>
-        <w:rPr>
-          <w:rFonts w:ascii="Times New Roman" w:hAnsi="Times New Roman"/>
-          <w:sz w:val="32"/>
-          <w:szCs w:val="32"/>
-        </w:rPr>
-        <w:t xml:space="preserve">operates to generate a continuous clock pulse, which </w:t>
-      </w:r>
-      <w:r>
-        <w:rPr>
-          <w:rFonts w:ascii="Times New Roman" w:hAnsi="Times New Roman"/>
-          <w:sz w:val="32"/>
-          <w:szCs w:val="32"/>
-        </w:rPr>
-        <w:t>activates</w:t>
-      </w:r>
-      <w:r>
-        <w:rPr>
-          <w:rFonts w:ascii="Times New Roman" w:hAnsi="Times New Roman"/>
-          <w:sz w:val="32"/>
-          <w:szCs w:val="32"/>
-        </w:rPr>
-        <w:t xml:space="preserve"> the CD4017 to cycle through its outputs.</w:t>
-      </w:r>
-      <w:r>
-        <w:rPr>
-          <w:rFonts w:ascii="Times New Roman" w:hAnsi="Times New Roman"/>
-          <w:sz w:val="32"/>
-          <w:szCs w:val="32"/>
-        </w:rPr>
-        <w:t xml:space="preserve"> </w:t>
-      </w:r>
-      <w:r>
-        <w:rPr>
-          <w:rFonts w:ascii="Times New Roman" w:hAnsi="Times New Roman"/>
-          <w:sz w:val="32"/>
-          <w:szCs w:val="32"/>
-        </w:rPr>
-        <w:t xml:space="preserve">The project will ensure traffic </w:t>
-      </w:r>
-      <w:r>
-        <w:rPr>
-          <w:rFonts w:ascii="Times New Roman" w:hAnsi="Times New Roman"/>
-          <w:sz w:val="32"/>
-          <w:szCs w:val="32"/>
-        </w:rPr>
-        <w:t>safety,</w:t>
-      </w:r>
-      <w:r>
-        <w:rPr>
-          <w:rFonts w:ascii="Times New Roman" w:hAnsi="Times New Roman"/>
-          <w:sz w:val="32"/>
-          <w:szCs w:val="32"/>
-        </w:rPr>
-        <w:t xml:space="preserve"> and it will serve as an effective demonstration of digital counting and basic electronic logic</w:t>
-      </w:r>
-      <w:r>
-        <w:rPr>
-          <w:rFonts w:ascii="Times New Roman" w:hAnsi="Times New Roman"/>
-          <w:sz w:val="32"/>
-          <w:szCs w:val="32"/>
-        </w:rPr>
-        <w:t>.</w:t>
-      </w:r>
-      <w:r>
-        <w:rPr>
-          <w:rFonts w:ascii="Times New Roman" w:hAnsi="Times New Roman"/>
-          <w:sz w:val="32"/>
-          <w:szCs w:val="32"/>
-        </w:rPr>
-        <w:t xml:space="preserve"> The </w:t>
-      </w:r>
-      <w:r>
-        <w:rPr>
-          <w:rFonts w:ascii="Times New Roman" w:hAnsi="Times New Roman"/>
-          <w:sz w:val="32"/>
-          <w:szCs w:val="32"/>
-        </w:rPr>
-        <w:t>design will</w:t>
-      </w:r>
-      <w:r>
-        <w:rPr>
-          <w:rFonts w:ascii="Times New Roman" w:hAnsi="Times New Roman"/>
-          <w:sz w:val="32"/>
-          <w:szCs w:val="32"/>
-        </w:rPr>
-        <w:t xml:space="preserve"> be verified on some software such as Multisim before implementing it on hardware. </w:t>
+          <w:sz w:val="32"/>
+          <w:szCs w:val="32"/>
+        </w:rPr>
+        <w:t xml:space="preserve">safe, coordinated two-way traffic flow and </w:t>
+      </w:r>
+      <w:r>
+        <w:rPr>
+          <w:rFonts w:ascii="Times New Roman" w:hAnsi="Times New Roman"/>
+          <w:sz w:val="32"/>
+          <w:szCs w:val="32"/>
+        </w:rPr>
+        <w:t>displays</w:t>
+      </w:r>
+      <w:r>
+        <w:rPr>
+          <w:rFonts w:ascii="Times New Roman" w:hAnsi="Times New Roman"/>
+          <w:sz w:val="32"/>
+          <w:szCs w:val="32"/>
+        </w:rPr>
+        <w:t xml:space="preserve"> digital counting, decoding, and timing logic. The design has been verified </w:t>
+      </w:r>
+      <w:r>
+        <w:rPr>
+          <w:rFonts w:ascii="Times New Roman" w:hAnsi="Times New Roman"/>
+          <w:sz w:val="32"/>
+          <w:szCs w:val="32"/>
+        </w:rPr>
+        <w:t>o</w:t>
+      </w:r>
+      <w:r>
+        <w:rPr>
+          <w:rFonts w:ascii="Times New Roman" w:hAnsi="Times New Roman"/>
+          <w:sz w:val="32"/>
+          <w:szCs w:val="32"/>
+        </w:rPr>
+        <w:t>n Multisim before implementation on hardware.</w:t>
       </w:r>
     </w:p>
     <w:p>
@@ -757,67 +782,158 @@
           <w:sz w:val="32"/>
           <w:szCs w:val="32"/>
         </w:rPr>
-        <w:t xml:space="preserve">The </w:t>
-      </w:r>
-      <w:r>
-        <w:rPr>
-          <w:rFonts w:ascii="Times New Roman" w:hAnsi="Times New Roman"/>
-          <w:b/>
-          <w:bCs/>
-          <w:sz w:val="32"/>
-          <w:szCs w:val="32"/>
-        </w:rPr>
-        <w:t xml:space="preserve">Automated </w:t>
-      </w:r>
-      <w:r>
-        <w:rPr>
-          <w:rFonts w:ascii="Times New Roman" w:hAnsi="Times New Roman"/>
-          <w:b/>
-          <w:bCs/>
-          <w:sz w:val="32"/>
-          <w:szCs w:val="32"/>
-        </w:rPr>
-        <w:t>Traffic Light Control System</w:t>
-      </w:r>
-      <w:r>
-        <w:rPr>
-          <w:rFonts w:ascii="Times New Roman" w:hAnsi="Times New Roman"/>
-          <w:sz w:val="32"/>
-          <w:szCs w:val="32"/>
-        </w:rPr>
-        <w:t xml:space="preserve"> aim</w:t>
-      </w:r>
-      <w:r>
-        <w:rPr>
-          <w:rFonts w:ascii="Times New Roman" w:hAnsi="Times New Roman"/>
-          <w:sz w:val="32"/>
-          <w:szCs w:val="32"/>
-        </w:rPr>
-        <w:t xml:space="preserve">s to </w:t>
-      </w:r>
-      <w:r>
-        <w:rPr>
-          <w:rFonts w:ascii="Times New Roman" w:hAnsi="Times New Roman"/>
-          <w:sz w:val="32"/>
-          <w:szCs w:val="32"/>
-        </w:rPr>
-        <w:t>design a hardware-based traffic light controller using dis</w:t>
-      </w:r>
-      <w:r>
-        <w:rPr>
-          <w:rFonts w:ascii="Times New Roman" w:hAnsi="Times New Roman"/>
-          <w:sz w:val="32"/>
-          <w:szCs w:val="32"/>
-        </w:rPr>
-        <w:t>tinct</w:t>
-      </w:r>
-      <w:r>
-        <w:rPr>
-          <w:rFonts w:ascii="Times New Roman" w:hAnsi="Times New Roman"/>
-          <w:sz w:val="32"/>
-          <w:szCs w:val="32"/>
-        </w:rPr>
-        <w:t xml:space="preserve"> integrated circuits.</w:t>
+        <w:t>The Automated Two-Way Traffic Light Control System aims to design a hardware-based traffic control</w:t>
+      </w:r>
+      <w:r>
+        <w:rPr>
+          <w:rFonts w:ascii="Times New Roman" w:hAnsi="Times New Roman"/>
+          <w:sz w:val="32"/>
+          <w:szCs w:val="32"/>
+        </w:rPr>
+        <w:t xml:space="preserve"> system</w:t>
+      </w:r>
+      <w:r>
+        <w:rPr>
+          <w:rFonts w:ascii="Times New Roman" w:hAnsi="Times New Roman"/>
+          <w:sz w:val="32"/>
+          <w:szCs w:val="32"/>
+        </w:rPr>
+        <w:t>, using</w:t>
+      </w:r>
+      <w:r>
+        <w:rPr>
+          <w:rFonts w:ascii="Times New Roman" w:hAnsi="Times New Roman"/>
+          <w:sz w:val="32"/>
+          <w:szCs w:val="32"/>
+        </w:rPr>
+        <w:t xml:space="preserve"> </w:t>
+      </w:r>
+      <w:r>
+        <w:rPr>
+          <w:rFonts w:ascii="Times New Roman" w:hAnsi="Times New Roman"/>
+          <w:sz w:val="32"/>
+          <w:szCs w:val="32"/>
+        </w:rPr>
+        <w:t>integrated circuits, that:</w:t>
+      </w:r>
+    </w:p>
+    <w:p>
+      <w:pPr>
+        <w:numPr>
+          <w:ilvl w:val="0"/>
+          <w:numId w:val="24"/>
+        </w:numPr>
+        <w:rPr>
+          <w:rFonts w:ascii="Times New Roman" w:hAnsi="Times New Roman"/>
+          <w:sz w:val="32"/>
+          <w:szCs w:val="32"/>
+        </w:rPr>
+      </w:pPr>
+      <w:r>
+        <w:rPr>
+          <w:rFonts w:ascii="Times New Roman" w:hAnsi="Times New Roman"/>
+          <w:sz w:val="32"/>
+          <w:szCs w:val="32"/>
+        </w:rPr>
+        <w:t>Cycles automatically through Red → Yellow → Green → Red using timer and counter ICs.</w:t>
+      </w:r>
+    </w:p>
+    <w:p>
+      <w:pPr>
+        <w:numPr>
+          <w:ilvl w:val="0"/>
+          <w:numId w:val="24"/>
+        </w:numPr>
+        <w:rPr>
+          <w:rFonts w:ascii="Times New Roman" w:hAnsi="Times New Roman"/>
+          <w:sz w:val="32"/>
+          <w:szCs w:val="32"/>
+        </w:rPr>
+      </w:pPr>
+      <w:r>
+        <w:rPr>
+          <w:rFonts w:ascii="Times New Roman" w:hAnsi="Times New Roman"/>
+          <w:sz w:val="32"/>
+          <w:szCs w:val="32"/>
+        </w:rPr>
+        <w:t xml:space="preserve">Coordinates two roads </w:t>
+      </w:r>
+      <w:r>
+        <w:rPr>
+          <w:rFonts w:ascii="Times New Roman" w:hAnsi="Times New Roman"/>
+          <w:sz w:val="32"/>
+          <w:szCs w:val="32"/>
+        </w:rPr>
+        <w:t xml:space="preserve">in a way </w:t>
+      </w:r>
+      <w:r>
+        <w:rPr>
+          <w:rFonts w:ascii="Times New Roman" w:hAnsi="Times New Roman"/>
+          <w:sz w:val="32"/>
+          <w:szCs w:val="32"/>
+        </w:rPr>
+        <w:t xml:space="preserve">that </w:t>
+      </w:r>
+      <w:r>
+        <w:rPr>
+          <w:rFonts w:ascii="Times New Roman" w:hAnsi="Times New Roman"/>
+          <w:sz w:val="32"/>
+          <w:szCs w:val="32"/>
+        </w:rPr>
+        <w:t xml:space="preserve">only one has a </w:t>
+      </w:r>
+      <w:r>
+        <w:rPr>
+          <w:rFonts w:ascii="Times New Roman" w:hAnsi="Times New Roman"/>
+          <w:sz w:val="32"/>
+          <w:szCs w:val="32"/>
+        </w:rPr>
+        <w:t>green</w:t>
+      </w:r>
+      <w:r>
+        <w:rPr>
+          <w:rFonts w:ascii="Times New Roman" w:hAnsi="Times New Roman"/>
+          <w:sz w:val="32"/>
+          <w:szCs w:val="32"/>
+        </w:rPr>
+        <w:t xml:space="preserve"> light at a time, allowing safe, alternating</w:t>
+      </w:r>
+      <w:r>
+        <w:rPr>
+          <w:rFonts w:ascii="Times New Roman" w:hAnsi="Times New Roman"/>
+          <w:sz w:val="32"/>
+          <w:szCs w:val="32"/>
+        </w:rPr>
+        <w:t xml:space="preserve"> traffic flow</w:t>
+      </w:r>
+      <w:r>
+        <w:rPr>
+          <w:rFonts w:ascii="Times New Roman" w:hAnsi="Times New Roman"/>
+          <w:sz w:val="32"/>
+          <w:szCs w:val="32"/>
+        </w:rPr>
+        <w:t>.</w:t>
+      </w:r>
+    </w:p>
+    <w:p>
+      <w:pPr>
+        <w:numPr>
+          <w:ilvl w:val="0"/>
+          <w:numId w:val="24"/>
+        </w:numPr>
+        <w:rPr>
+          <w:rFonts w:ascii="Times New Roman" w:hAnsi="Times New Roman"/>
+          <w:sz w:val="32"/>
+          <w:szCs w:val="32"/>
+        </w:rPr>
+      </w:pPr>
+      <w:r>
+        <w:rPr>
+          <w:rFonts w:ascii="Times New Roman" w:hAnsi="Times New Roman"/>
+          <w:sz w:val="32"/>
+          <w:szCs w:val="32"/>
+        </w:rPr>
+        <w:t>Shows a live countdown on a 7-segment display so drivers can see how much time is left in each signal phase.</w:t>
       </w:r>
     </w:p>
     <w:p>
@@ -855,63 +971,71 @@
           <w:sz w:val="32"/>
           <w:szCs w:val="32"/>
         </w:rPr>
-        <w:t>The project works by</w:t>
-      </w:r>
-      <w:r>
-        <w:rPr>
-          <w:rFonts w:ascii="Times New Roman" w:hAnsi="Times New Roman"/>
-          <w:sz w:val="32"/>
-          <w:szCs w:val="32"/>
-        </w:rPr>
-        <w:t xml:space="preserve"> using</w:t>
-      </w:r>
-      <w:r>
-        <w:rPr>
-          <w:rFonts w:ascii="Times New Roman" w:hAnsi="Times New Roman"/>
-          <w:sz w:val="32"/>
-          <w:szCs w:val="32"/>
-        </w:rPr>
-        <w:t xml:space="preserve"> </w:t>
-      </w:r>
-      <w:r>
-        <w:rPr>
-          <w:rFonts w:ascii="Times New Roman" w:hAnsi="Times New Roman"/>
-          <w:sz w:val="32"/>
-          <w:szCs w:val="32"/>
-        </w:rPr>
-        <w:t xml:space="preserve">simple digital logic components like IC’s instead of using </w:t>
-      </w:r>
-      <w:r>
-        <w:rPr>
-          <w:rFonts w:ascii="Times New Roman" w:hAnsi="Times New Roman"/>
-          <w:sz w:val="32"/>
-          <w:szCs w:val="32"/>
-        </w:rPr>
-        <w:t xml:space="preserve">big </w:t>
-      </w:r>
-      <w:r>
-        <w:rPr>
-          <w:rFonts w:ascii="Times New Roman" w:hAnsi="Times New Roman"/>
-          <w:sz w:val="32"/>
-          <w:szCs w:val="32"/>
-        </w:rPr>
-        <w:t>program</w:t>
-      </w:r>
-      <w:r>
-        <w:rPr>
-          <w:rFonts w:ascii="Times New Roman" w:hAnsi="Times New Roman"/>
-          <w:sz w:val="32"/>
-          <w:szCs w:val="32"/>
-        </w:rPr>
-        <w:t>mable logics</w:t>
-      </w:r>
-      <w:r>
-        <w:rPr>
-          <w:rFonts w:ascii="Times New Roman" w:hAnsi="Times New Roman"/>
-          <w:sz w:val="32"/>
-          <w:szCs w:val="32"/>
-        </w:rPr>
-        <w:t xml:space="preserve">. </w:t>
+        <w:t xml:space="preserve">The project uses simple digital ICs instead of </w:t>
+      </w:r>
+      <w:r>
+        <w:rPr>
+          <w:rFonts w:ascii="Times New Roman" w:hAnsi="Times New Roman"/>
+          <w:sz w:val="32"/>
+          <w:szCs w:val="32"/>
+        </w:rPr>
+        <w:t>programmable</w:t>
+      </w:r>
+      <w:r>
+        <w:rPr>
+          <w:rFonts w:ascii="Times New Roman" w:hAnsi="Times New Roman"/>
+          <w:sz w:val="32"/>
+          <w:szCs w:val="32"/>
+        </w:rPr>
+        <w:t xml:space="preserve"> logic. A 555 Timer generates continuous clock pulses, with resistors and capacitors setting the pulse rate. These pulses drive a CD4017 decade counter, which turns off its </w:t>
+      </w:r>
+      <w:r>
+        <w:rPr>
+          <w:rFonts w:ascii="Times New Roman" w:hAnsi="Times New Roman"/>
+          <w:sz w:val="32"/>
+          <w:szCs w:val="32"/>
+        </w:rPr>
+        <w:t xml:space="preserve">existing </w:t>
+      </w:r>
+      <w:r>
+        <w:rPr>
+          <w:rFonts w:ascii="Times New Roman" w:hAnsi="Times New Roman"/>
+          <w:sz w:val="32"/>
+          <w:szCs w:val="32"/>
+        </w:rPr>
+        <w:t xml:space="preserve">output and turns on the next </w:t>
+      </w:r>
+      <w:r>
+        <w:rPr>
+          <w:rFonts w:ascii="Times New Roman" w:hAnsi="Times New Roman"/>
+          <w:sz w:val="32"/>
+          <w:szCs w:val="32"/>
+        </w:rPr>
+        <w:t>one</w:t>
+      </w:r>
+      <w:r>
+        <w:rPr>
+          <w:rFonts w:ascii="Times New Roman" w:hAnsi="Times New Roman"/>
+          <w:sz w:val="32"/>
+          <w:szCs w:val="32"/>
+        </w:rPr>
+        <w:t xml:space="preserve"> with e</w:t>
+      </w:r>
+      <w:r>
+        <w:rPr>
+          <w:rFonts w:ascii="Times New Roman" w:hAnsi="Times New Roman"/>
+          <w:sz w:val="32"/>
+          <w:szCs w:val="32"/>
+        </w:rPr>
+        <w:t xml:space="preserve">ach </w:t>
+      </w:r>
+      <w:r>
+        <w:rPr>
+          <w:rFonts w:ascii="Times New Roman" w:hAnsi="Times New Roman"/>
+          <w:sz w:val="32"/>
+          <w:szCs w:val="32"/>
+        </w:rPr>
+        <w:t>pulse.</w:t>
       </w:r>
     </w:p>
     <w:p>
@@ -928,25 +1052,24 @@
           <w:sz w:val="32"/>
           <w:szCs w:val="32"/>
         </w:rPr>
-        <w:t>T</w:t>
-      </w:r>
-      <w:r>
-        <w:rPr>
-          <w:rFonts w:ascii="Times New Roman" w:hAnsi="Times New Roman"/>
-          <w:sz w:val="32"/>
-          <w:szCs w:val="32"/>
-        </w:rPr>
-        <w:t xml:space="preserve">he </w:t>
-      </w:r>
-      <w:r>
-        <w:rPr>
-          <w:rFonts w:ascii="Times New Roman" w:hAnsi="Times New Roman"/>
-          <w:b/>
-          <w:bCs/>
-          <w:sz w:val="32"/>
-          <w:szCs w:val="32"/>
-        </w:rPr>
-        <w:t>555 Timer</w:t>
+        <w:lastRenderedPageBreak/>
+        <w:t xml:space="preserve">Since Red and Green need to stay </w:t>
+      </w:r>
+      <w:r>
+        <w:rPr>
+          <w:rFonts w:ascii="Times New Roman" w:hAnsi="Times New Roman"/>
+          <w:sz w:val="32"/>
+          <w:szCs w:val="32"/>
+        </w:rPr>
+        <w:t>ON</w:t>
+      </w:r>
+      <w:r>
+        <w:rPr>
+          <w:rFonts w:ascii="Times New Roman" w:hAnsi="Times New Roman"/>
+          <w:sz w:val="32"/>
+          <w:szCs w:val="32"/>
+        </w:rPr>
+        <w:t xml:space="preserve"> longer than Yellow, diodes (1BH62) group</w:t>
       </w:r>
       <w:r>
         <w:rPr>
@@ -962,73 +1085,7 @@
           <w:sz w:val="32"/>
           <w:szCs w:val="32"/>
         </w:rPr>
-        <w:t>works</w:t>
-      </w:r>
-      <w:r>
-        <w:rPr>
-          <w:rFonts w:ascii="Times New Roman" w:hAnsi="Times New Roman"/>
-          <w:sz w:val="32"/>
-          <w:szCs w:val="32"/>
-        </w:rPr>
-        <w:t xml:space="preserve"> </w:t>
-      </w:r>
-      <w:r>
-        <w:rPr>
-          <w:rFonts w:ascii="Times New Roman" w:hAnsi="Times New Roman"/>
-          <w:sz w:val="32"/>
-          <w:szCs w:val="32"/>
-        </w:rPr>
-        <w:t>as a clock</w:t>
-      </w:r>
-      <w:r>
-        <w:rPr>
-          <w:rFonts w:ascii="Times New Roman" w:hAnsi="Times New Roman"/>
-          <w:sz w:val="32"/>
-          <w:szCs w:val="32"/>
-        </w:rPr>
-        <w:t xml:space="preserve">, </w:t>
-      </w:r>
-      <w:r>
-        <w:rPr>
-          <w:rFonts w:ascii="Times New Roman" w:hAnsi="Times New Roman"/>
-          <w:sz w:val="32"/>
-          <w:szCs w:val="32"/>
-        </w:rPr>
-        <w:t xml:space="preserve">continuously </w:t>
-      </w:r>
-      <w:r>
-        <w:rPr>
-          <w:rFonts w:ascii="Times New Roman" w:hAnsi="Times New Roman"/>
-          <w:sz w:val="32"/>
-          <w:szCs w:val="32"/>
-        </w:rPr>
-        <w:t>sending electrical pulses.</w:t>
-      </w:r>
-      <w:r>
-        <w:rPr>
-          <w:rFonts w:ascii="Times New Roman" w:hAnsi="Times New Roman"/>
-          <w:sz w:val="32"/>
-          <w:szCs w:val="32"/>
-        </w:rPr>
-        <w:t xml:space="preserve"> The speed of the pulses is controlled by </w:t>
-      </w:r>
-      <w:r>
-        <w:rPr>
-          <w:rFonts w:ascii="Times New Roman" w:hAnsi="Times New Roman"/>
-          <w:b/>
-          <w:bCs/>
-          <w:sz w:val="32"/>
-          <w:szCs w:val="32"/>
-        </w:rPr>
-        <w:t>resistors and capacitors</w:t>
-      </w:r>
-      <w:r>
-        <w:rPr>
-          <w:rFonts w:ascii="Times New Roman" w:hAnsi="Times New Roman"/>
-          <w:sz w:val="32"/>
-          <w:szCs w:val="32"/>
-        </w:rPr>
-        <w:t>.</w:t>
+        <w:t>several CD4017 outputs per color, giving Red and Green a longer combined ON time than Yellow.</w:t>
       </w:r>
     </w:p>
     <w:p>
@@ -1045,121 +1102,161 @@
           <w:sz w:val="32"/>
           <w:szCs w:val="32"/>
         </w:rPr>
-        <w:t xml:space="preserve">These pulses travel to </w:t>
-      </w:r>
-      <w:r>
-        <w:rPr>
-          <w:rFonts w:ascii="Times New Roman" w:hAnsi="Times New Roman"/>
-          <w:b/>
-          <w:bCs/>
-          <w:sz w:val="32"/>
-          <w:szCs w:val="32"/>
-        </w:rPr>
-        <w:t>CD4017</w:t>
-      </w:r>
-      <w:r>
-        <w:rPr>
-          <w:rFonts w:ascii="Times New Roman" w:hAnsi="Times New Roman"/>
-          <w:sz w:val="32"/>
-          <w:szCs w:val="32"/>
-        </w:rPr>
-        <w:t xml:space="preserve">, </w:t>
-      </w:r>
-      <w:r>
-        <w:rPr>
-          <w:rFonts w:ascii="Times New Roman" w:hAnsi="Times New Roman"/>
-          <w:sz w:val="32"/>
-          <w:szCs w:val="32"/>
-        </w:rPr>
-        <w:t xml:space="preserve">a decade counter </w:t>
-      </w:r>
-      <w:r>
-        <w:rPr>
-          <w:rFonts w:ascii="Times New Roman" w:hAnsi="Times New Roman"/>
-          <w:sz w:val="32"/>
-          <w:szCs w:val="32"/>
-        </w:rPr>
-        <w:t>having</w:t>
-      </w:r>
-      <w:r>
-        <w:rPr>
-          <w:rFonts w:ascii="Times New Roman" w:hAnsi="Times New Roman"/>
-          <w:sz w:val="32"/>
-          <w:szCs w:val="32"/>
-        </w:rPr>
-        <w:t xml:space="preserve"> 10 outputs (</w:t>
-      </w:r>
-      <w:r>
-        <w:rPr>
-          <w:rFonts w:ascii="Times New Roman" w:hAnsi="Times New Roman"/>
-          <w:sz w:val="32"/>
-          <w:szCs w:val="32"/>
-        </w:rPr>
-        <w:t>counts from 0 to 9</w:t>
-      </w:r>
-      <w:r>
-        <w:rPr>
-          <w:rFonts w:ascii="Times New Roman" w:hAnsi="Times New Roman"/>
-          <w:sz w:val="32"/>
-          <w:szCs w:val="32"/>
-        </w:rPr>
-        <w:t>)</w:t>
-      </w:r>
-      <w:r>
-        <w:rPr>
-          <w:rFonts w:ascii="Times New Roman" w:hAnsi="Times New Roman"/>
-          <w:sz w:val="32"/>
-          <w:szCs w:val="32"/>
-        </w:rPr>
-        <w:t xml:space="preserve">. </w:t>
-      </w:r>
-      <w:r>
-        <w:rPr>
-          <w:rFonts w:ascii="Times New Roman" w:hAnsi="Times New Roman"/>
-          <w:sz w:val="32"/>
-          <w:szCs w:val="32"/>
-        </w:rPr>
-        <w:t xml:space="preserve">Every time it receives a pulse from the timer, it turns </w:t>
-      </w:r>
-      <w:r>
-        <w:rPr>
-          <w:rFonts w:ascii="Times New Roman" w:hAnsi="Times New Roman"/>
-          <w:sz w:val="32"/>
-          <w:szCs w:val="32"/>
-        </w:rPr>
-        <w:t>OFF</w:t>
-      </w:r>
-      <w:r>
-        <w:rPr>
-          <w:rFonts w:ascii="Times New Roman" w:hAnsi="Times New Roman"/>
-          <w:sz w:val="32"/>
-          <w:szCs w:val="32"/>
-        </w:rPr>
-        <w:t xml:space="preserve"> the current pin and turns </w:t>
-      </w:r>
-      <w:r>
-        <w:rPr>
-          <w:rFonts w:ascii="Times New Roman" w:hAnsi="Times New Roman"/>
-          <w:sz w:val="32"/>
-          <w:szCs w:val="32"/>
-        </w:rPr>
-        <w:t>ON</w:t>
-      </w:r>
-      <w:r>
-        <w:rPr>
-          <w:rFonts w:ascii="Times New Roman" w:hAnsi="Times New Roman"/>
-          <w:sz w:val="32"/>
-          <w:szCs w:val="32"/>
-        </w:rPr>
-        <w:t xml:space="preserve"> the next </w:t>
-      </w:r>
-      <w:r>
-        <w:rPr>
-          <w:rFonts w:ascii="Times New Roman" w:hAnsi="Times New Roman"/>
-          <w:sz w:val="32"/>
-          <w:szCs w:val="32"/>
-        </w:rPr>
-        <w:t>pin.</w:t>
+        <w:t xml:space="preserve">For </w:t>
+      </w:r>
+      <w:r>
+        <w:rPr>
+          <w:rFonts w:ascii="Times New Roman" w:hAnsi="Times New Roman"/>
+          <w:sz w:val="32"/>
+          <w:szCs w:val="32"/>
+        </w:rPr>
+        <w:t>2</w:t>
+      </w:r>
+      <w:r>
+        <w:rPr>
+          <w:rFonts w:ascii="Times New Roman" w:hAnsi="Times New Roman"/>
+          <w:sz w:val="32"/>
+          <w:szCs w:val="32"/>
+        </w:rPr>
+        <w:t xml:space="preserve">-way operation, the CD4017 outputs are </w:t>
+      </w:r>
+      <w:r>
+        <w:rPr>
+          <w:rFonts w:ascii="Times New Roman" w:hAnsi="Times New Roman"/>
+          <w:sz w:val="32"/>
+          <w:szCs w:val="32"/>
+        </w:rPr>
+        <w:t>positioned</w:t>
+      </w:r>
+      <w:r>
+        <w:rPr>
+          <w:rFonts w:ascii="Times New Roman" w:hAnsi="Times New Roman"/>
+          <w:sz w:val="32"/>
+          <w:szCs w:val="32"/>
+        </w:rPr>
+        <w:t xml:space="preserve"> so the two roads are always in opposite states</w:t>
+      </w:r>
+      <w:r>
+        <w:rPr>
+          <w:rFonts w:ascii="Times New Roman" w:hAnsi="Times New Roman"/>
+          <w:sz w:val="32"/>
+          <w:szCs w:val="32"/>
+        </w:rPr>
+        <w:t>,</w:t>
+      </w:r>
+      <w:r>
+        <w:rPr>
+          <w:rFonts w:ascii="Times New Roman" w:hAnsi="Times New Roman"/>
+          <w:sz w:val="32"/>
+          <w:szCs w:val="32"/>
+        </w:rPr>
+        <w:t xml:space="preserve"> one road's </w:t>
+      </w:r>
+      <w:proofErr w:type="gramStart"/>
+      <w:r>
+        <w:rPr>
+          <w:rFonts w:ascii="Times New Roman" w:hAnsi="Times New Roman"/>
+          <w:sz w:val="32"/>
+          <w:szCs w:val="32"/>
+        </w:rPr>
+        <w:t>Red</w:t>
+      </w:r>
+      <w:proofErr w:type="gramEnd"/>
+      <w:r>
+        <w:rPr>
+          <w:rFonts w:ascii="Times New Roman" w:hAnsi="Times New Roman"/>
+          <w:sz w:val="32"/>
+          <w:szCs w:val="32"/>
+        </w:rPr>
+        <w:t xml:space="preserve"> </w:t>
+      </w:r>
+      <w:r>
+        <w:rPr>
+          <w:rFonts w:ascii="Times New Roman" w:hAnsi="Times New Roman"/>
+          <w:sz w:val="32"/>
+          <w:szCs w:val="32"/>
+        </w:rPr>
+        <w:t xml:space="preserve">light </w:t>
+      </w:r>
+      <w:r>
+        <w:rPr>
+          <w:rFonts w:ascii="Times New Roman" w:hAnsi="Times New Roman"/>
+          <w:sz w:val="32"/>
+          <w:szCs w:val="32"/>
+        </w:rPr>
+        <w:t>aligns with the other's Green, and both briefly show</w:t>
+      </w:r>
+      <w:r>
+        <w:rPr>
+          <w:rFonts w:ascii="Times New Roman" w:hAnsi="Times New Roman"/>
+          <w:sz w:val="32"/>
+          <w:szCs w:val="32"/>
+        </w:rPr>
+        <w:t>s</w:t>
+      </w:r>
+      <w:r>
+        <w:rPr>
+          <w:rFonts w:ascii="Times New Roman" w:hAnsi="Times New Roman"/>
+          <w:sz w:val="32"/>
+          <w:szCs w:val="32"/>
+        </w:rPr>
+        <w:t xml:space="preserve"> Yellow during the switch</w:t>
+      </w:r>
+      <w:r>
+        <w:rPr>
+          <w:rFonts w:ascii="Times New Roman" w:hAnsi="Times New Roman"/>
+          <w:sz w:val="32"/>
+          <w:szCs w:val="32"/>
+        </w:rPr>
+        <w:t>,</w:t>
+      </w:r>
+      <w:r>
+        <w:rPr>
+          <w:rFonts w:ascii="Times New Roman" w:hAnsi="Times New Roman"/>
+          <w:sz w:val="32"/>
+          <w:szCs w:val="32"/>
+        </w:rPr>
+        <w:t xml:space="preserve"> ensuring only one direction has </w:t>
+      </w:r>
+      <w:r>
+        <w:rPr>
+          <w:rFonts w:ascii="Times New Roman" w:hAnsi="Times New Roman"/>
+          <w:sz w:val="32"/>
+          <w:szCs w:val="32"/>
+        </w:rPr>
+        <w:t>traffic flow</w:t>
+      </w:r>
+      <w:r>
+        <w:rPr>
+          <w:rFonts w:ascii="Times New Roman" w:hAnsi="Times New Roman"/>
+          <w:sz w:val="32"/>
+          <w:szCs w:val="32"/>
+        </w:rPr>
+        <w:t xml:space="preserve"> at a time, using a single counter and </w:t>
+      </w:r>
+      <w:r>
+        <w:rPr>
+          <w:rFonts w:ascii="Times New Roman" w:hAnsi="Times New Roman"/>
+          <w:sz w:val="32"/>
+          <w:szCs w:val="32"/>
+        </w:rPr>
+        <w:t xml:space="preserve">a set of </w:t>
+      </w:r>
+      <w:r>
+        <w:rPr>
+          <w:rFonts w:ascii="Times New Roman" w:hAnsi="Times New Roman"/>
+          <w:sz w:val="32"/>
+          <w:szCs w:val="32"/>
+        </w:rPr>
+        <w:t>diodes</w:t>
+      </w:r>
+      <w:r>
+        <w:rPr>
+          <w:rFonts w:ascii="Times New Roman" w:hAnsi="Times New Roman"/>
+          <w:sz w:val="32"/>
+          <w:szCs w:val="32"/>
+        </w:rPr>
+        <w:t xml:space="preserve"> for both roads.</w:t>
       </w:r>
     </w:p>
     <w:p>
@@ -1176,368 +1273,23 @@
           <w:sz w:val="32"/>
           <w:szCs w:val="32"/>
         </w:rPr>
-        <w:t>As we know,</w:t>
-      </w:r>
-      <w:r>
-        <w:rPr>
-          <w:rFonts w:ascii="Times New Roman" w:hAnsi="Times New Roman"/>
-          <w:sz w:val="32"/>
-          <w:szCs w:val="32"/>
-        </w:rPr>
-        <w:t xml:space="preserve"> a real traffic light needs Red and Green to stay on longer than Yellow.</w:t>
-      </w:r>
-      <w:r>
-        <w:rPr>
-          <w:rFonts w:ascii="Times New Roman" w:hAnsi="Times New Roman"/>
-          <w:sz w:val="32"/>
-          <w:szCs w:val="32"/>
-        </w:rPr>
-        <w:t xml:space="preserve"> So i</w:t>
-      </w:r>
-      <w:r>
-        <w:rPr>
-          <w:rFonts w:ascii="Times New Roman" w:hAnsi="Times New Roman"/>
-          <w:sz w:val="32"/>
-          <w:szCs w:val="32"/>
-        </w:rPr>
-        <w:t xml:space="preserve">nstead of having every light stay on for the same amount of time, we use </w:t>
-      </w:r>
-      <w:r>
-        <w:rPr>
-          <w:rFonts w:ascii="Times New Roman" w:hAnsi="Times New Roman"/>
-          <w:b/>
-          <w:bCs/>
-          <w:sz w:val="32"/>
-          <w:szCs w:val="32"/>
-        </w:rPr>
-        <w:t>diodes</w:t>
-      </w:r>
-      <w:r>
-        <w:rPr>
-          <w:rFonts w:ascii="Times New Roman" w:hAnsi="Times New Roman"/>
-          <w:sz w:val="32"/>
-          <w:szCs w:val="32"/>
-        </w:rPr>
-        <w:t xml:space="preserve"> </w:t>
-      </w:r>
-      <w:r>
-        <w:rPr>
-          <w:rFonts w:ascii="Times New Roman" w:hAnsi="Times New Roman"/>
-          <w:sz w:val="32"/>
-          <w:szCs w:val="32"/>
-        </w:rPr>
-        <w:t xml:space="preserve">to group the counts together. </w:t>
-      </w:r>
-      <w:r>
-        <w:rPr>
-          <w:rFonts w:ascii="Times New Roman" w:hAnsi="Times New Roman"/>
-          <w:sz w:val="32"/>
-          <w:szCs w:val="32"/>
-        </w:rPr>
-        <w:t>W</w:t>
-      </w:r>
-      <w:r>
-        <w:rPr>
-          <w:rFonts w:ascii="Times New Roman" w:hAnsi="Times New Roman"/>
-          <w:sz w:val="32"/>
-          <w:szCs w:val="32"/>
-        </w:rPr>
-        <w:t>e wired four counts to Red</w:t>
-      </w:r>
-      <w:r>
-        <w:rPr>
-          <w:rFonts w:ascii="Times New Roman" w:hAnsi="Times New Roman"/>
-          <w:sz w:val="32"/>
-          <w:szCs w:val="32"/>
-        </w:rPr>
-        <w:t xml:space="preserve"> and Green</w:t>
-      </w:r>
-      <w:r>
-        <w:rPr>
-          <w:rFonts w:ascii="Times New Roman" w:hAnsi="Times New Roman"/>
-          <w:sz w:val="32"/>
-          <w:szCs w:val="32"/>
-        </w:rPr>
-        <w:t xml:space="preserve">, </w:t>
-      </w:r>
-      <w:r>
-        <w:rPr>
-          <w:rFonts w:ascii="Times New Roman" w:hAnsi="Times New Roman"/>
-          <w:sz w:val="32"/>
-          <w:szCs w:val="32"/>
-        </w:rPr>
-        <w:t xml:space="preserve">but </w:t>
-      </w:r>
-      <w:r>
-        <w:rPr>
-          <w:rFonts w:ascii="Times New Roman" w:hAnsi="Times New Roman"/>
-          <w:sz w:val="32"/>
-          <w:szCs w:val="32"/>
-        </w:rPr>
-        <w:t xml:space="preserve">only one to Yellow, </w:t>
-      </w:r>
-      <w:r>
-        <w:rPr>
-          <w:rFonts w:ascii="Times New Roman" w:hAnsi="Times New Roman"/>
-          <w:sz w:val="32"/>
-          <w:szCs w:val="32"/>
-        </w:rPr>
-        <w:t xml:space="preserve">due to which </w:t>
-      </w:r>
-      <w:r>
-        <w:rPr>
-          <w:rFonts w:ascii="Times New Roman" w:hAnsi="Times New Roman"/>
-          <w:sz w:val="32"/>
-          <w:szCs w:val="32"/>
-        </w:rPr>
-        <w:t xml:space="preserve">the </w:t>
-      </w:r>
-      <w:r>
-        <w:rPr>
-          <w:rFonts w:ascii="Times New Roman" w:hAnsi="Times New Roman"/>
-          <w:sz w:val="32"/>
-          <w:szCs w:val="32"/>
-        </w:rPr>
-        <w:t>red and green</w:t>
-      </w:r>
-      <w:r>
-        <w:rPr>
-          <w:rFonts w:ascii="Times New Roman" w:hAnsi="Times New Roman"/>
-          <w:sz w:val="32"/>
-          <w:szCs w:val="32"/>
-        </w:rPr>
-        <w:t xml:space="preserve"> lights stay </w:t>
-      </w:r>
-      <w:r>
-        <w:rPr>
-          <w:rFonts w:ascii="Times New Roman" w:hAnsi="Times New Roman"/>
-          <w:sz w:val="32"/>
-          <w:szCs w:val="32"/>
-        </w:rPr>
-        <w:t>ON</w:t>
-      </w:r>
-      <w:r>
-        <w:rPr>
-          <w:rFonts w:ascii="Times New Roman" w:hAnsi="Times New Roman"/>
-          <w:sz w:val="32"/>
-          <w:szCs w:val="32"/>
-        </w:rPr>
-        <w:t xml:space="preserve"> much longer, perfectly </w:t>
-      </w:r>
-      <w:r>
-        <w:rPr>
-          <w:rFonts w:ascii="Times New Roman" w:hAnsi="Times New Roman"/>
-          <w:sz w:val="32"/>
-          <w:szCs w:val="32"/>
-        </w:rPr>
-        <w:t xml:space="preserve">showing </w:t>
-      </w:r>
-      <w:r>
-        <w:rPr>
-          <w:rFonts w:ascii="Times New Roman" w:hAnsi="Times New Roman"/>
-          <w:sz w:val="32"/>
-          <w:szCs w:val="32"/>
-        </w:rPr>
-        <w:t>how a real-world traffic signal</w:t>
-      </w:r>
-      <w:r>
-        <w:rPr>
-          <w:rFonts w:ascii="Times New Roman" w:hAnsi="Times New Roman"/>
-          <w:sz w:val="32"/>
-          <w:szCs w:val="32"/>
-        </w:rPr>
-        <w:t xml:space="preserve"> works</w:t>
-      </w:r>
-      <w:r>
-        <w:rPr>
-          <w:rFonts w:ascii="Times New Roman" w:hAnsi="Times New Roman"/>
-          <w:sz w:val="32"/>
-          <w:szCs w:val="32"/>
-        </w:rPr>
-        <w:t>.</w:t>
-      </w:r>
-    </w:p>
-    <w:p>
-      <w:pPr>
-        <w:rPr>
-          <w:rFonts w:ascii="Times New Roman" w:hAnsi="Times New Roman"/>
-          <w:sz w:val="32"/>
-          <w:szCs w:val="32"/>
-        </w:rPr>
-      </w:pPr>
-      <w:r>
-        <w:rPr>
-          <w:rFonts w:ascii="Times New Roman" w:hAnsi="Times New Roman"/>
-          <w:sz w:val="32"/>
-          <w:szCs w:val="32"/>
-        </w:rPr>
-        <w:t>T</w:t>
-      </w:r>
-      <w:r>
-        <w:rPr>
-          <w:rFonts w:ascii="Times New Roman" w:hAnsi="Times New Roman"/>
-          <w:sz w:val="32"/>
-          <w:szCs w:val="32"/>
-        </w:rPr>
-        <w:t xml:space="preserve">he circuit </w:t>
-      </w:r>
-      <w:r>
-        <w:rPr>
-          <w:rFonts w:ascii="Times New Roman" w:hAnsi="Times New Roman"/>
-          <w:sz w:val="32"/>
-          <w:szCs w:val="32"/>
-        </w:rPr>
-        <w:t xml:space="preserve">works in a </w:t>
-      </w:r>
-      <w:r>
-        <w:rPr>
-          <w:rFonts w:ascii="Times New Roman" w:hAnsi="Times New Roman"/>
-          <w:sz w:val="32"/>
-          <w:szCs w:val="32"/>
-        </w:rPr>
-        <w:t xml:space="preserve">continuous loop </w:t>
-      </w:r>
-      <w:r>
-        <w:rPr>
-          <w:rFonts w:ascii="Times New Roman" w:hAnsi="Times New Roman"/>
-          <w:b/>
-          <w:bCs/>
-          <w:sz w:val="32"/>
-          <w:szCs w:val="32"/>
-        </w:rPr>
-        <w:t>Red</w:t>
-      </w:r>
-      <w:r>
-        <w:rPr>
-          <w:rFonts w:ascii="Times New Roman" w:hAnsi="Times New Roman"/>
-          <w:sz w:val="32"/>
-          <w:szCs w:val="32"/>
-        </w:rPr>
-        <w:t xml:space="preserve"> </w:t>
-      </w:r>
-      <w:r>
-        <w:rPr>
-          <w:rFonts w:ascii="Times New Roman" w:hAnsi="Times New Roman"/>
-          <w:sz w:val="32"/>
-          <w:szCs w:val="32"/>
-        </w:rPr>
-        <w:t>for a long count (Stop)</w:t>
-      </w:r>
-      <w:r>
-        <w:rPr>
-          <w:rFonts w:ascii="Times New Roman" w:hAnsi="Times New Roman"/>
-          <w:sz w:val="32"/>
-          <w:szCs w:val="32"/>
-        </w:rPr>
-        <w:t xml:space="preserve">, </w:t>
-      </w:r>
-      <w:r>
-        <w:rPr>
-          <w:rFonts w:ascii="Times New Roman" w:hAnsi="Times New Roman"/>
-          <w:b/>
-          <w:bCs/>
-          <w:sz w:val="32"/>
-          <w:szCs w:val="32"/>
-        </w:rPr>
-        <w:t>Yellow</w:t>
-      </w:r>
-      <w:r>
-        <w:rPr>
-          <w:rFonts w:ascii="Times New Roman" w:hAnsi="Times New Roman"/>
-          <w:sz w:val="32"/>
-          <w:szCs w:val="32"/>
-        </w:rPr>
-        <w:t xml:space="preserve"> for </w:t>
-      </w:r>
-      <w:r>
-        <w:rPr>
-          <w:rFonts w:ascii="Times New Roman" w:hAnsi="Times New Roman"/>
-          <w:sz w:val="32"/>
-          <w:szCs w:val="32"/>
-        </w:rPr>
-        <w:t xml:space="preserve">a little </w:t>
-      </w:r>
-      <w:r>
-        <w:rPr>
-          <w:rFonts w:ascii="Times New Roman" w:hAnsi="Times New Roman"/>
-          <w:sz w:val="32"/>
-          <w:szCs w:val="32"/>
-        </w:rPr>
-        <w:t>count (Prepare)</w:t>
-      </w:r>
-      <w:r>
-        <w:rPr>
-          <w:rFonts w:ascii="Times New Roman" w:hAnsi="Times New Roman"/>
-          <w:sz w:val="32"/>
-          <w:szCs w:val="32"/>
-        </w:rPr>
-        <w:t xml:space="preserve">, </w:t>
-      </w:r>
-      <w:r>
-        <w:rPr>
-          <w:rFonts w:ascii="Times New Roman" w:hAnsi="Times New Roman"/>
-          <w:b/>
-          <w:bCs/>
-          <w:sz w:val="32"/>
-          <w:szCs w:val="32"/>
-        </w:rPr>
-        <w:t>Green</w:t>
-      </w:r>
-      <w:r>
-        <w:rPr>
-          <w:rFonts w:ascii="Times New Roman" w:hAnsi="Times New Roman"/>
-          <w:sz w:val="32"/>
-          <w:szCs w:val="32"/>
-        </w:rPr>
-        <w:t xml:space="preserve"> for a long count (Go).</w:t>
-      </w:r>
-      <w:r>
-        <w:rPr>
-          <w:rFonts w:ascii="Times New Roman" w:hAnsi="Times New Roman"/>
-          <w:sz w:val="32"/>
-          <w:szCs w:val="32"/>
-        </w:rPr>
-        <w:t xml:space="preserve"> </w:t>
-      </w:r>
-      <w:r>
-        <w:rPr>
-          <w:rFonts w:ascii="Times New Roman" w:hAnsi="Times New Roman"/>
-          <w:sz w:val="32"/>
-          <w:szCs w:val="32"/>
-        </w:rPr>
-        <w:t>A tiny paus</w:t>
-      </w:r>
-      <w:r>
-        <w:rPr>
-          <w:rFonts w:ascii="Times New Roman" w:hAnsi="Times New Roman"/>
-          <w:sz w:val="32"/>
-          <w:szCs w:val="32"/>
-        </w:rPr>
-        <w:t>e</w:t>
-      </w:r>
-      <w:r>
-        <w:rPr>
-          <w:rFonts w:ascii="Times New Roman" w:hAnsi="Times New Roman"/>
-          <w:sz w:val="32"/>
-          <w:szCs w:val="32"/>
-        </w:rPr>
-        <w:t xml:space="preserve">, and then it starts all over again </w:t>
-      </w:r>
-      <w:r>
-        <w:rPr>
-          <w:rFonts w:ascii="Times New Roman" w:hAnsi="Times New Roman"/>
-          <w:sz w:val="32"/>
-          <w:szCs w:val="32"/>
-        </w:rPr>
-        <w:t>from red</w:t>
-      </w:r>
-      <w:r>
-        <w:rPr>
-          <w:rFonts w:ascii="Times New Roman" w:hAnsi="Times New Roman"/>
-          <w:sz w:val="32"/>
-          <w:szCs w:val="32"/>
-        </w:rPr>
-        <w:t>.</w:t>
+        <w:t xml:space="preserve">A 74LS192 decade counter and a CD4511 BCD-to-seven-segment decoder drive a 7-segment display, with each segment protected by a 220Ω resistor. The display counts down about 3 seconds per light, completing one full </w:t>
+      </w:r>
+      <w:r>
+        <w:rPr>
+          <w:rFonts w:ascii="Times New Roman" w:hAnsi="Times New Roman"/>
+          <w:sz w:val="32"/>
+          <w:szCs w:val="32"/>
+        </w:rPr>
+        <w:t>9</w:t>
+      </w:r>
+      <w:r>
+        <w:rPr>
+          <w:rFonts w:ascii="Times New Roman" w:hAnsi="Times New Roman"/>
+          <w:sz w:val="32"/>
+          <w:szCs w:val="32"/>
+        </w:rPr>
+        <w:t>-second Red-Yellow-Green cycle before restarting.</w:t>
       </w:r>
     </w:p>
     <w:p>
@@ -1558,7 +1310,6 @@
           <w:sz w:val="36"/>
           <w:szCs w:val="36"/>
         </w:rPr>
-        <w:lastRenderedPageBreak/>
         <w:t>Multisim Implementation:</w:t>
       </w:r>
     </w:p>
@@ -1584,14 +1335,15 @@
       <w:r>
         <w:rPr>
           <w:rFonts w:ascii="Times New Roman" w:hAnsi="Times New Roman"/>
+          <w:noProof/>
           <w:sz w:val="32"/>
           <w:szCs w:val="32"/>
         </w:rPr>
         <w:drawing>
-          <wp:inline distT="0" distB="0" distL="0" distR="0" wp14:anchorId="224D512E" wp14:editId="2108E501">
-            <wp:extent cx="6858000" cy="2614295"/>
-            <wp:effectExtent l="0" t="0" r="0" b="0"/>
-            <wp:docPr id="1" name="Picture 1"/>
+          <wp:inline distT="0" distB="0" distL="0" distR="0" wp14:anchorId="32CA46D9" wp14:editId="6DA42B11">
+            <wp:extent cx="6858000" cy="2893060"/>
+            <wp:effectExtent l="0" t="0" r="0" b="2540"/>
+            <wp:docPr id="1093811117" name="Picture 1"/>
             <wp:cNvGraphicFramePr>
               <a:graphicFrameLocks xmlns:a="http://schemas.openxmlformats.org/drawingml/2006/main" noChangeAspect="1"/>
             </wp:cNvGraphicFramePr>
@@ -1599,11 +1351,17 @@
               <a:graphicData uri="http://schemas.openxmlformats.org/drawingml/2006/picture">
                 <pic:pic xmlns:pic="http://schemas.openxmlformats.org/drawingml/2006/picture">
                   <pic:nvPicPr>
-                    <pic:cNvPr id="1" name=""/>
+                    <pic:cNvPr id="1093811117" name="Picture 1093811117"/>
                     <pic:cNvPicPr/>
                   </pic:nvPicPr>
                   <pic:blipFill>
-                    <a:blip r:embed="rId6"/>
+                    <a:blip r:embed="rId7">
+                      <a:extLst>
+                        <a:ext uri="{28A0092B-C50C-407E-A947-70E740481C1C}">
+                          <a14:useLocalDpi xmlns:a14="http://schemas.microsoft.com/office/drawing/2010/main" val="0"/>
+                        </a:ext>
+                      </a:extLst>
+                    </a:blip>
                     <a:stretch>
                       <a:fillRect/>
                     </a:stretch>
@@ -1611,7 +1369,7 @@
                   <pic:spPr>
                     <a:xfrm>
                       <a:off x="0" y="0"/>
-                      <a:ext cx="6858000" cy="2614295"/>
+                      <a:ext cx="6858000" cy="2893060"/>
                     </a:xfrm>
                     <a:prstGeom prst="rect">
                       <a:avLst/>
@@ -1749,6 +1507,55 @@
         <w:pStyle w:val="ListParagraph"/>
         <w:numPr>
           <w:ilvl w:val="0"/>
+          <w:numId w:val="6"/>
+        </w:numPr>
+        <w:spacing w:after="80" w:line="240" w:lineRule="auto"/>
+        <w:contextualSpacing w:val="0"/>
+        <w:rPr>
+          <w:rFonts w:ascii="Times New Roman" w:hAnsi="Times New Roman" w:cs="Times New Roman"/>
+          <w:sz w:val="32"/>
+          <w:szCs w:val="32"/>
+        </w:rPr>
+      </w:pPr>
+      <w:r>
+        <w:rPr>
+          <w:rFonts w:ascii="Times New Roman" w:hAnsi="Times New Roman" w:cs="Times New Roman"/>
+          <w:sz w:val="32"/>
+          <w:szCs w:val="32"/>
+        </w:rPr>
+        <w:t>74LS192 Synchronous 4-bit Decade Counter</w:t>
+      </w:r>
+    </w:p>
+    <w:p>
+      <w:pPr>
+        <w:pStyle w:val="ListParagraph"/>
+        <w:numPr>
+          <w:ilvl w:val="0"/>
+          <w:numId w:val="6"/>
+        </w:numPr>
+        <w:spacing w:after="80" w:line="240" w:lineRule="auto"/>
+        <w:contextualSpacing w:val="0"/>
+        <w:rPr>
+          <w:rFonts w:ascii="Times New Roman" w:hAnsi="Times New Roman" w:cs="Times New Roman"/>
+          <w:sz w:val="32"/>
+          <w:szCs w:val="32"/>
+        </w:rPr>
+      </w:pPr>
+      <w:r>
+        <w:rPr>
+          <w:rFonts w:ascii="Times New Roman" w:hAnsi="Times New Roman" w:cs="Times New Roman"/>
+          <w:sz w:val="32"/>
+          <w:szCs w:val="32"/>
+        </w:rPr>
+        <w:lastRenderedPageBreak/>
+        <w:t>CD4511 BCD-to-Seven-Segment Decoder</w:t>
+      </w:r>
+    </w:p>
+    <w:p>
+      <w:pPr>
+        <w:pStyle w:val="ListParagraph"/>
+        <w:numPr>
+          <w:ilvl w:val="0"/>
           <w:numId w:val="4"/>
         </w:numPr>
         <w:rPr>
@@ -1889,7 +1696,23 @@
           <w:sz w:val="32"/>
           <w:szCs w:val="32"/>
         </w:rPr>
-        <w:t xml:space="preserve">2.2k </w:t>
+        <w:t>2</w:t>
+      </w:r>
+      <w:r>
+        <w:rPr>
+          <w:rFonts w:ascii="Times New Roman" w:hAnsi="Times New Roman" w:cs="Calibri"/>
+          <w:sz w:val="32"/>
+          <w:szCs w:val="32"/>
+        </w:rPr>
+        <w:t>20</w:t>
+      </w:r>
+      <w:r>
+        <w:rPr>
+          <w:rFonts w:ascii="Times New Roman" w:hAnsi="Times New Roman" w:cs="Calibri"/>
+          <w:sz w:val="32"/>
+          <w:szCs w:val="32"/>
+        </w:rPr>
+        <w:t xml:space="preserve"> </w:t>
       </w:r>
       <w:r>
         <w:rPr>
@@ -2089,6 +1912,122 @@
           <w:sz w:val="32"/>
           <w:szCs w:val="32"/>
         </w:rPr>
+        <w:t>SWITCHES</w:t>
+      </w:r>
+    </w:p>
+    <w:p>
+      <w:pPr>
+        <w:pStyle w:val="ListParagraph"/>
+        <w:numPr>
+          <w:ilvl w:val="0"/>
+          <w:numId w:val="23"/>
+        </w:numPr>
+        <w:rPr>
+          <w:rFonts w:ascii="Times New Roman" w:hAnsi="Times New Roman"/>
+          <w:sz w:val="32"/>
+          <w:szCs w:val="32"/>
+        </w:rPr>
+      </w:pPr>
+      <w:r>
+        <w:rPr>
+          <w:rFonts w:ascii="Times New Roman" w:hAnsi="Times New Roman"/>
+          <w:sz w:val="32"/>
+          <w:szCs w:val="32"/>
+        </w:rPr>
+        <w:t>Push Button</w:t>
+      </w:r>
+    </w:p>
+    <w:p>
+      <w:pPr>
+        <w:pStyle w:val="ListParagraph"/>
+        <w:numPr>
+          <w:ilvl w:val="0"/>
+          <w:numId w:val="4"/>
+        </w:numPr>
+        <w:spacing w:before="150" w:after="80"/>
+        <w:rPr>
+          <w:rFonts w:ascii="Times New Roman" w:hAnsi="Times New Roman" w:cs="Times New Roman"/>
+          <w:sz w:val="32"/>
+          <w:szCs w:val="32"/>
+        </w:rPr>
+      </w:pPr>
+      <w:r>
+        <w:rPr>
+          <w:rFonts w:ascii="Times New Roman" w:hAnsi="Times New Roman" w:cs="Times New Roman"/>
+          <w:b/>
+          <w:bCs/>
+          <w:sz w:val="32"/>
+          <w:szCs w:val="32"/>
+        </w:rPr>
+        <w:t>D</w:t>
+      </w:r>
+      <w:r>
+        <w:rPr>
+          <w:rFonts w:ascii="Times New Roman" w:hAnsi="Times New Roman" w:cs="Times New Roman"/>
+          <w:b/>
+          <w:bCs/>
+          <w:sz w:val="32"/>
+          <w:szCs w:val="32"/>
+        </w:rPr>
+        <w:t>ISPLAY</w:t>
+      </w:r>
+      <w:r>
+        <w:rPr>
+          <w:rFonts w:ascii="Times New Roman" w:hAnsi="Times New Roman" w:cs="Times New Roman"/>
+          <w:b/>
+          <w:bCs/>
+          <w:sz w:val="32"/>
+          <w:szCs w:val="32"/>
+        </w:rPr>
+        <w:t>:</w:t>
+      </w:r>
+    </w:p>
+    <w:p>
+      <w:pPr>
+        <w:pStyle w:val="ListParagraph"/>
+        <w:numPr>
+          <w:ilvl w:val="0"/>
+          <w:numId w:val="21"/>
+        </w:numPr>
+        <w:spacing w:after="80" w:line="240" w:lineRule="auto"/>
+        <w:rPr>
+          <w:rFonts w:ascii="Times New Roman" w:hAnsi="Times New Roman" w:cs="Times New Roman"/>
+          <w:sz w:val="32"/>
+          <w:szCs w:val="32"/>
+        </w:rPr>
+      </w:pPr>
+      <w:r>
+        <w:rPr>
+          <w:rFonts w:ascii="Times New Roman" w:hAnsi="Times New Roman" w:cs="Times New Roman"/>
+          <w:sz w:val="32"/>
+          <w:szCs w:val="32"/>
+        </w:rPr>
+        <w:t>Common-Cathode 7-Segment LED Display</w:t>
+      </w:r>
+    </w:p>
+    <w:p>
+      <w:pPr>
+        <w:pStyle w:val="ListParagraph"/>
+        <w:numPr>
+          <w:ilvl w:val="0"/>
+          <w:numId w:val="4"/>
+        </w:numPr>
+        <w:rPr>
+          <w:rFonts w:ascii="Times New Roman" w:hAnsi="Times New Roman"/>
+          <w:b/>
+          <w:bCs/>
+          <w:sz w:val="32"/>
+          <w:szCs w:val="32"/>
+        </w:rPr>
+      </w:pPr>
+      <w:r>
+        <w:rPr>
+          <w:rFonts w:ascii="Times New Roman" w:hAnsi="Times New Roman"/>
+          <w:b/>
+          <w:bCs/>
+          <w:sz w:val="32"/>
+          <w:szCs w:val="32"/>
+        </w:rPr>
         <w:t>POWER &amp; PROTOTYPING:</w:t>
       </w:r>
     </w:p>
@@ -2162,6 +2101,30 @@
           <w:szCs w:val="32"/>
         </w:rPr>
         <w:t>Battery</w:t>
+      </w:r>
+    </w:p>
+    <w:p>
+      <w:pPr>
+        <w:pStyle w:val="ListParagraph"/>
+        <w:numPr>
+          <w:ilvl w:val="0"/>
+          <w:numId w:val="11"/>
+        </w:numPr>
+        <w:rPr>
+          <w:rFonts w:ascii="Times New Roman" w:hAnsi="Times New Roman"/>
+          <w:b/>
+          <w:bCs/>
+          <w:sz w:val="32"/>
+          <w:szCs w:val="32"/>
+        </w:rPr>
+      </w:pPr>
+      <w:r>
+        <w:rPr>
+          <w:rFonts w:ascii="Times New Roman" w:hAnsi="Times New Roman"/>
+          <w:sz w:val="32"/>
+          <w:szCs w:val="32"/>
+        </w:rPr>
+        <w:t>5V Regulated Supply</w:t>
       </w:r>
     </w:p>
     <w:sectPr>
@@ -2181,7 +2144,7 @@
 </file>
 
 <file path=word/numbering.xml><?xml version="1.0" encoding="utf-8"?>
-<w:numbering xmlns:wpc="http://schemas.microsoft.com/office/word/2010/wordprocessingCanvas" xmlns:cx="http://schemas.microsoft.com/office/drawing/2014/chartex" xmlns:cx1="http://schemas.microsoft.com/office/drawing/2015/9/8/chartex" xmlns:cx2="http://schemas.microsoft.com/office/drawing/2015/10/21/chartex" xmlns:cx3="http://schemas.microsoft.com/office/drawing/2016/5/9/chartex" xmlns:cx4="http://schemas.microsoft.com/office/drawing/2016/5/10/chartex" xmlns:cx5="http://schemas.microsoft.com/office/drawing/2016/5/11/chartex" xmlns:cx6="http://schemas.microsoft.com/office/drawing/2016/5/12/chartex" xmlns:cx7="http://schemas.microsoft.com/office/drawing/2016/5/13/chartex" xmlns:cx8="http://schemas.microsoft.com/office/drawing/2016/5/14/chartex" xmlns:mc="http://schemas.openxmlformats.org/markup-compatibility/2006" xmlns:aink="http://schemas.microsoft.com/office/drawing/2016/ink" xmlns:am3d="http://schemas.microsoft.com/office/drawing/2017/model3d" xmlns:o="urn:schemas-microsoft-com:office:office" xmlns:oel="http://schemas.microsoft.com/office/2019/extlst" xmlns:r="http://schemas.openxmlformats.org/officeDocument/2006/relationships" xmlns:m="http://schemas.openxmlformats.org/officeDocument/2006/math" xmlns:v="urn:schemas-microsoft-com:vml" xmlns:wp14="http://schemas.microsoft.com/office/word/2010/wordprocessingDrawing" xmlns:wp="http://schemas.openxmlformats.org/drawingml/2006/wordprocessingDrawing" xmlns:w10="urn:schemas-microsoft-com:office:word" xmlns:w="http://schemas.openxmlformats.org/wordprocessingml/2006/main" xmlns:w14="http://schemas.microsoft.com/office/word/2010/wordml" xmlns:w15="http://schemas.microsoft.com/office/word/2012/wordml" xmlns:w16cex="http://schemas.microsoft.com/office/word/2018/wordml/cex" xmlns:w16cid="http://schemas.microsoft.com/office/word/2016/wordml/cid" xmlns:w16="http://schemas.microsoft.com/office/word/2018/wordml" xmlns:w16sdtdh="http://schemas.microsoft.com/office/word/2020/wordml/sdtdatahash" xmlns:w16se="http://schemas.microsoft.com/office/word/2015/wordml/symex" xmlns:wpg="http://schemas.microsoft.com/office/word/2010/wordprocessingGroup" xmlns:wpi="http://schemas.microsoft.com/office/word/2010/wordprocessingInk" xmlns:wne="http://schemas.microsoft.com/office/word/2006/wordml" xmlns:wps="http://schemas.microsoft.com/office/word/2010/wordprocessingShape" mc:Ignorable="w14 w15 w16se w16cid w16 w16cex w16sdtdh wp14">
+<w:numbering xmlns:wpc="http://schemas.microsoft.com/office/word/2010/wordprocessingCanvas" xmlns:cx="http://schemas.microsoft.com/office/drawing/2014/chartex" xmlns:cx1="http://schemas.microsoft.com/office/drawing/2015/9/8/chartex" xmlns:cx2="http://schemas.microsoft.com/office/drawing/2015/10/21/chartex" xmlns:cx3="http://schemas.microsoft.com/office/drawing/2016/5/9/chartex" xmlns:cx4="http://schemas.microsoft.com/office/drawing/2016/5/10/chartex" xmlns:cx5="http://schemas.microsoft.com/office/drawing/2016/5/11/chartex" xmlns:cx6="http://schemas.microsoft.com/office/drawing/2016/5/12/chartex" xmlns:cx7="http://schemas.microsoft.com/office/drawing/2016/5/13/chartex" xmlns:cx8="http://schemas.microsoft.com/office/drawing/2016/5/14/chartex" xmlns:mc="http://schemas.openxmlformats.org/markup-compatibility/2006" xmlns:aink="http://schemas.microsoft.com/office/drawing/2016/ink" xmlns:am3d="http://schemas.microsoft.com/office/drawing/2017/model3d" xmlns:o="urn:schemas-microsoft-com:office:office" xmlns:oel="http://schemas.microsoft.com/office/2019/extlst" xmlns:r="http://schemas.openxmlformats.org/officeDocument/2006/relationships" xmlns:m="http://schemas.openxmlformats.org/officeDocument/2006/math" xmlns:v="urn:schemas-microsoft-com:vml" xmlns:wp14="http://schemas.microsoft.com/office/word/2010/wordprocessingDrawing" xmlns:wp="http://schemas.openxmlformats.org/drawingml/2006/wordprocessingDrawing" xmlns:w10="urn:schemas-microsoft-com:office:word" xmlns:w="http://schemas.openxmlformats.org/wordprocessingml/2006/main" xmlns:w14="http://schemas.microsoft.com/office/word/2010/wordml" xmlns:w15="http://schemas.microsoft.com/office/word/2012/wordml" xmlns:w16cex="http://schemas.microsoft.com/office/word/2018/wordml/cex" xmlns:w16cid="http://schemas.microsoft.com/office/word/2016/wordml/cid" xmlns:w16="http://schemas.microsoft.com/office/word/2018/wordml" xmlns:w16du="http://schemas.microsoft.com/office/word/2023/wordml/word16du" xmlns:w16sdtdh="http://schemas.microsoft.com/office/word/2020/wordml/sdtdatahash" xmlns:w16sdtfl="http://schemas.microsoft.com/office/word/2024/wordml/sdtformatlock" xmlns:w16se="http://schemas.microsoft.com/office/word/2015/wordml/symex" xmlns:wpg="http://schemas.microsoft.com/office/word/2010/wordprocessingGroup" xmlns:wpi="http://schemas.microsoft.com/office/word/2010/wordprocessingInk" xmlns:wne="http://schemas.microsoft.com/office/word/2006/wordml" xmlns:wps="http://schemas.microsoft.com/office/word/2010/wordprocessingShape" mc:Ignorable="w14 w15 w16se w16cid w16 w16cex w16sdtdh w16sdtfl w16du wp14">
   <w:abstractNum w:abstractNumId="0" w15:restartNumberingAfterBreak="0">
     <w:nsid w:val="03701A93"/>
     <w:multiLevelType w:val="hybridMultilevel"/>
@@ -3087,6 +3050,119 @@
     </w:lvl>
   </w:abstractNum>
   <w:abstractNum w:abstractNumId="8" w15:restartNumberingAfterBreak="0">
+    <w:nsid w:val="38752D61"/>
+    <w:multiLevelType w:val="hybridMultilevel"/>
+    <w:tmpl w:val="412E0A9E"/>
+    <w:lvl w:ilvl="0" w:tplc="04090001">
+      <w:start w:val="1"/>
+      <w:numFmt w:val="bullet"/>
+      <w:lvlText w:val=""/>
+      <w:lvlJc w:val="left"/>
+      <w:pPr>
+        <w:ind w:left="1080" w:hanging="360"/>
+      </w:pPr>
+      <w:rPr>
+        <w:rFonts w:ascii="Symbol" w:hAnsi="Symbol" w:hint="default"/>
+      </w:rPr>
+    </w:lvl>
+    <w:lvl w:ilvl="1" w:tplc="04090003" w:tentative="1">
+      <w:start w:val="1"/>
+      <w:numFmt w:val="bullet"/>
+      <w:lvlText w:val="o"/>
+      <w:lvlJc w:val="left"/>
+      <w:pPr>
+        <w:ind w:left="1800" w:hanging="360"/>
+      </w:pPr>
+      <w:rPr>
+        <w:rFonts w:ascii="Courier New" w:hAnsi="Courier New" w:cs="Courier New" w:hint="default"/>
+      </w:rPr>
+    </w:lvl>
+    <w:lvl w:ilvl="2" w:tplc="04090005" w:tentative="1">
+      <w:start w:val="1"/>
+      <w:numFmt w:val="bullet"/>
+      <w:lvlText w:val=""/>
+      <w:lvlJc w:val="left"/>
+      <w:pPr>
+        <w:ind w:left="2520" w:hanging="360"/>
+      </w:pPr>
+      <w:rPr>
+        <w:rFonts w:ascii="Wingdings" w:hAnsi="Wingdings" w:hint="default"/>
+      </w:rPr>
+    </w:lvl>
+    <w:lvl w:ilvl="3" w:tplc="04090001" w:tentative="1">
+      <w:start w:val="1"/>
+      <w:numFmt w:val="bullet"/>
+      <w:lvlText w:val=""/>
+      <w:lvlJc w:val="left"/>
+      <w:pPr>
+        <w:ind w:left="3240" w:hanging="360"/>
+      </w:pPr>
+      <w:rPr>
+        <w:rFonts w:ascii="Symbol" w:hAnsi="Symbol" w:hint="default"/>
+      </w:rPr>
+    </w:lvl>
+    <w:lvl w:ilvl="4" w:tplc="04090003" w:tentative="1">
+      <w:start w:val="1"/>
+      <w:numFmt w:val="bullet"/>
+      <w:lvlText w:val="o"/>
+      <w:lvlJc w:val="left"/>
+      <w:pPr>
+        <w:ind w:left="3960" w:hanging="360"/>
+      </w:pPr>
+      <w:rPr>
+        <w:rFonts w:ascii="Courier New" w:hAnsi="Courier New" w:cs="Courier New" w:hint="default"/>
+      </w:rPr>
+    </w:lvl>
+    <w:lvl w:ilvl="5" w:tplc="04090005" w:tentative="1">
+      <w:start w:val="1"/>
+      <w:numFmt w:val="bullet"/>
+      <w:lvlText w:val=""/>
+      <w:lvlJc w:val="left"/>
+      <w:pPr>
+        <w:ind w:left="4680" w:hanging="360"/>
+      </w:pPr>
+      <w:rPr>
+        <w:rFonts w:ascii="Wingdings" w:hAnsi="Wingdings" w:hint="default"/>
+      </w:rPr>
+    </w:lvl>
+    <w:lvl w:ilvl="6" w:tplc="04090001" w:tentative="1">
+      <w:start w:val="1"/>
+      <w:numFmt w:val="bullet"/>
+      <w:lvlText w:val=""/>
+      <w:lvlJc w:val="left"/>
+      <w:pPr>
+        <w:ind w:left="5400" w:hanging="360"/>
+      </w:pPr>
+      <w:rPr>
+        <w:rFonts w:ascii="Symbol" w:hAnsi="Symbol" w:hint="default"/>
+      </w:rPr>
+    </w:lvl>
+    <w:lvl w:ilvl="7" w:tplc="04090003" w:tentative="1">
+      <w:start w:val="1"/>
+      <w:numFmt w:val="bullet"/>
+      <w:lvlText w:val="o"/>
+      <w:lvlJc w:val="left"/>
+      <w:pPr>
+        <w:ind w:left="6120" w:hanging="360"/>
+      </w:pPr>
+      <w:rPr>
+        <w:rFonts w:ascii="Courier New" w:hAnsi="Courier New" w:cs="Courier New" w:hint="default"/>
+      </w:rPr>
+    </w:lvl>
+    <w:lvl w:ilvl="8" w:tplc="04090005" w:tentative="1">
+      <w:start w:val="1"/>
+      <w:numFmt w:val="bullet"/>
+      <w:lvlText w:val=""/>
+      <w:lvlJc w:val="left"/>
+      <w:pPr>
+        <w:ind w:left="6840" w:hanging="360"/>
+      </w:pPr>
+      <w:rPr>
+        <w:rFonts w:ascii="Wingdings" w:hAnsi="Wingdings" w:hint="default"/>
+      </w:rPr>
+    </w:lvl>
+  </w:abstractNum>
+  <w:abstractNum w:abstractNumId="9" w15:restartNumberingAfterBreak="0">
     <w:nsid w:val="3B002EF0"/>
     <w:multiLevelType w:val="hybridMultilevel"/>
     <w:tmpl w:val="733AF468"/>
@@ -3199,7 +3275,120 @@
       </w:rPr>
     </w:lvl>
   </w:abstractNum>
-  <w:abstractNum w:abstractNumId="9" w15:restartNumberingAfterBreak="0">
+  <w:abstractNum w:abstractNumId="10" w15:restartNumberingAfterBreak="0">
+    <w:nsid w:val="3B1D7760"/>
+    <w:multiLevelType w:val="hybridMultilevel"/>
+    <w:tmpl w:val="D0C81D22"/>
+    <w:lvl w:ilvl="0" w:tplc="04090001">
+      <w:start w:val="1"/>
+      <w:numFmt w:val="bullet"/>
+      <w:lvlText w:val=""/>
+      <w:lvlJc w:val="left"/>
+      <w:pPr>
+        <w:ind w:left="1080" w:hanging="360"/>
+      </w:pPr>
+      <w:rPr>
+        <w:rFonts w:ascii="Symbol" w:hAnsi="Symbol" w:hint="default"/>
+      </w:rPr>
+    </w:lvl>
+    <w:lvl w:ilvl="1" w:tplc="04090003" w:tentative="1">
+      <w:start w:val="1"/>
+      <w:numFmt w:val="bullet"/>
+      <w:lvlText w:val="o"/>
+      <w:lvlJc w:val="left"/>
+      <w:pPr>
+        <w:ind w:left="1800" w:hanging="360"/>
+      </w:pPr>
+      <w:rPr>
+        <w:rFonts w:ascii="Courier New" w:hAnsi="Courier New" w:cs="Courier New" w:hint="default"/>
+      </w:rPr>
+    </w:lvl>
+    <w:lvl w:ilvl="2" w:tplc="04090005" w:tentative="1">
+      <w:start w:val="1"/>
+      <w:numFmt w:val="bullet"/>
+      <w:lvlText w:val=""/>
+      <w:lvlJc w:val="left"/>
+      <w:pPr>
+        <w:ind w:left="2520" w:hanging="360"/>
+      </w:pPr>
+      <w:rPr>
+        <w:rFonts w:ascii="Wingdings" w:hAnsi="Wingdings" w:hint="default"/>
+      </w:rPr>
+    </w:lvl>
+    <w:lvl w:ilvl="3" w:tplc="04090001" w:tentative="1">
+      <w:start w:val="1"/>
+      <w:numFmt w:val="bullet"/>
+      <w:lvlText w:val=""/>
+      <w:lvlJc w:val="left"/>
+      <w:pPr>
+        <w:ind w:left="3240" w:hanging="360"/>
+      </w:pPr>
+      <w:rPr>
+        <w:rFonts w:ascii="Symbol" w:hAnsi="Symbol" w:hint="default"/>
+      </w:rPr>
+    </w:lvl>
+    <w:lvl w:ilvl="4" w:tplc="04090003" w:tentative="1">
+      <w:start w:val="1"/>
+      <w:numFmt w:val="bullet"/>
+      <w:lvlText w:val="o"/>
+      <w:lvlJc w:val="left"/>
+      <w:pPr>
+        <w:ind w:left="3960" w:hanging="360"/>
+      </w:pPr>
+      <w:rPr>
+        <w:rFonts w:ascii="Courier New" w:hAnsi="Courier New" w:cs="Courier New" w:hint="default"/>
+      </w:rPr>
+    </w:lvl>
+    <w:lvl w:ilvl="5" w:tplc="04090005" w:tentative="1">
+      <w:start w:val="1"/>
+      <w:numFmt w:val="bullet"/>
+      <w:lvlText w:val=""/>
+      <w:lvlJc w:val="left"/>
+      <w:pPr>
+        <w:ind w:left="4680" w:hanging="360"/>
+      </w:pPr>
+      <w:rPr>
+        <w:rFonts w:ascii="Wingdings" w:hAnsi="Wingdings" w:hint="default"/>
+      </w:rPr>
+    </w:lvl>
+    <w:lvl w:ilvl="6" w:tplc="04090001" w:tentative="1">
+      <w:start w:val="1"/>
+      <w:numFmt w:val="bullet"/>
+      <w:lvlText w:val=""/>
+      <w:lvlJc w:val="left"/>
+      <w:pPr>
+        <w:ind w:left="5400" w:hanging="360"/>
+      </w:pPr>
+      <w:rPr>
+        <w:rFonts w:ascii="Symbol" w:hAnsi="Symbol" w:hint="default"/>
+      </w:rPr>
+    </w:lvl>
+    <w:lvl w:ilvl="7" w:tplc="04090003" w:tentative="1">
+      <w:start w:val="1"/>
+      <w:numFmt w:val="bullet"/>
+      <w:lvlText w:val="o"/>
+      <w:lvlJc w:val="left"/>
+      <w:pPr>
+        <w:ind w:left="6120" w:hanging="360"/>
+      </w:pPr>
+      <w:rPr>
+        <w:rFonts w:ascii="Courier New" w:hAnsi="Courier New" w:cs="Courier New" w:hint="default"/>
+      </w:rPr>
+    </w:lvl>
+    <w:lvl w:ilvl="8" w:tplc="04090005" w:tentative="1">
+      <w:start w:val="1"/>
+      <w:numFmt w:val="bullet"/>
+      <w:lvlText w:val=""/>
+      <w:lvlJc w:val="left"/>
+      <w:pPr>
+        <w:ind w:left="6840" w:hanging="360"/>
+      </w:pPr>
+      <w:rPr>
+        <w:rFonts w:ascii="Wingdings" w:hAnsi="Wingdings" w:hint="default"/>
+      </w:rPr>
+    </w:lvl>
+  </w:abstractNum>
+  <w:abstractNum w:abstractNumId="11" w15:restartNumberingAfterBreak="0">
     <w:nsid w:val="408030CF"/>
     <w:multiLevelType w:val="hybridMultilevel"/>
     <w:tmpl w:val="8068BB4C"/>
@@ -3312,7 +3501,199 @@
       </w:rPr>
     </w:lvl>
   </w:abstractNum>
-  <w:abstractNum w:abstractNumId="10" w15:restartNumberingAfterBreak="0">
+  <w:abstractNum w:abstractNumId="12" w15:restartNumberingAfterBreak="0">
+    <w:nsid w:val="41AC343D"/>
+    <w:multiLevelType w:val="hybridMultilevel"/>
+    <w:tmpl w:val="A8FA2142"/>
+    <w:lvl w:ilvl="0" w:tplc="337439E6">
+      <w:start w:val="1"/>
+      <w:numFmt w:val="bullet"/>
+      <w:lvlText w:val="•"/>
+      <w:lvlJc w:val="left"/>
+      <w:pPr>
+        <w:ind w:left="504" w:hanging="288"/>
+      </w:pPr>
+    </w:lvl>
+    <w:lvl w:ilvl="1" w:tplc="8EA01510">
+      <w:start w:val="1"/>
+      <w:numFmt w:val="bullet"/>
+      <w:lvlText w:val="o"/>
+      <w:lvlJc w:val="left"/>
+      <w:pPr>
+        <w:ind w:left="1008" w:hanging="288"/>
+      </w:pPr>
+    </w:lvl>
+    <w:lvl w:ilvl="2" w:tplc="8E70E248">
+      <w:numFmt w:val="decimal"/>
+      <w:lvlText w:val=""/>
+      <w:lvlJc w:val="left"/>
+      <w:pPr>
+        <w:ind w:left="0" w:firstLine="0"/>
+      </w:pPr>
+    </w:lvl>
+    <w:lvl w:ilvl="3" w:tplc="65B41B6A">
+      <w:numFmt w:val="decimal"/>
+      <w:lvlText w:val=""/>
+      <w:lvlJc w:val="left"/>
+      <w:pPr>
+        <w:ind w:left="0" w:firstLine="0"/>
+      </w:pPr>
+    </w:lvl>
+    <w:lvl w:ilvl="4" w:tplc="327E8C68">
+      <w:numFmt w:val="decimal"/>
+      <w:lvlText w:val=""/>
+      <w:lvlJc w:val="left"/>
+      <w:pPr>
+        <w:ind w:left="0" w:firstLine="0"/>
+      </w:pPr>
+    </w:lvl>
+    <w:lvl w:ilvl="5" w:tplc="12FCA6CC">
+      <w:numFmt w:val="decimal"/>
+      <w:lvlText w:val=""/>
+      <w:lvlJc w:val="left"/>
+      <w:pPr>
+        <w:ind w:left="0" w:firstLine="0"/>
+      </w:pPr>
+    </w:lvl>
+    <w:lvl w:ilvl="6" w:tplc="6506FA4E">
+      <w:numFmt w:val="decimal"/>
+      <w:lvlText w:val=""/>
+      <w:lvlJc w:val="left"/>
+      <w:pPr>
+        <w:ind w:left="0" w:firstLine="0"/>
+      </w:pPr>
+    </w:lvl>
+    <w:lvl w:ilvl="7" w:tplc="22A0DBC6">
+      <w:numFmt w:val="decimal"/>
+      <w:lvlText w:val=""/>
+      <w:lvlJc w:val="left"/>
+      <w:pPr>
+        <w:ind w:left="0" w:firstLine="0"/>
+      </w:pPr>
+    </w:lvl>
+    <w:lvl w:ilvl="8" w:tplc="DE588F9C">
+      <w:numFmt w:val="decimal"/>
+      <w:lvlText w:val=""/>
+      <w:lvlJc w:val="left"/>
+      <w:pPr>
+        <w:ind w:left="0" w:firstLine="0"/>
+      </w:pPr>
+    </w:lvl>
+  </w:abstractNum>
+  <w:abstractNum w:abstractNumId="13" w15:restartNumberingAfterBreak="0">
+    <w:nsid w:val="46B95B29"/>
+    <w:multiLevelType w:val="hybridMultilevel"/>
+    <w:tmpl w:val="E736AB46"/>
+    <w:lvl w:ilvl="0" w:tplc="04090001">
+      <w:start w:val="1"/>
+      <w:numFmt w:val="bullet"/>
+      <w:lvlText w:val=""/>
+      <w:lvlJc w:val="left"/>
+      <w:pPr>
+        <w:ind w:left="1440" w:hanging="360"/>
+      </w:pPr>
+      <w:rPr>
+        <w:rFonts w:ascii="Symbol" w:hAnsi="Symbol" w:hint="default"/>
+      </w:rPr>
+    </w:lvl>
+    <w:lvl w:ilvl="1" w:tplc="04090003" w:tentative="1">
+      <w:start w:val="1"/>
+      <w:numFmt w:val="bullet"/>
+      <w:lvlText w:val="o"/>
+      <w:lvlJc w:val="left"/>
+      <w:pPr>
+        <w:ind w:left="2160" w:hanging="360"/>
+      </w:pPr>
+      <w:rPr>
+        <w:rFonts w:ascii="Courier New" w:hAnsi="Courier New" w:cs="Courier New" w:hint="default"/>
+      </w:rPr>
+    </w:lvl>
+    <w:lvl w:ilvl="2" w:tplc="04090005" w:tentative="1">
+      <w:start w:val="1"/>
+      <w:numFmt w:val="bullet"/>
+      <w:lvlText w:val=""/>
+      <w:lvlJc w:val="left"/>
+      <w:pPr>
+        <w:ind w:left="2880" w:hanging="360"/>
+      </w:pPr>
+      <w:rPr>
+        <w:rFonts w:ascii="Wingdings" w:hAnsi="Wingdings" w:hint="default"/>
+      </w:rPr>
+    </w:lvl>
+    <w:lvl w:ilvl="3" w:tplc="04090001" w:tentative="1">
+      <w:start w:val="1"/>
+      <w:numFmt w:val="bullet"/>
+      <w:lvlText w:val=""/>
+      <w:lvlJc w:val="left"/>
+      <w:pPr>
+        <w:ind w:left="3600" w:hanging="360"/>
+      </w:pPr>
+      <w:rPr>
+        <w:rFonts w:ascii="Symbol" w:hAnsi="Symbol" w:hint="default"/>
+      </w:rPr>
+    </w:lvl>
+    <w:lvl w:ilvl="4" w:tplc="04090003" w:tentative="1">
+      <w:start w:val="1"/>
+      <w:numFmt w:val="bullet"/>
+      <w:lvlText w:val="o"/>
+      <w:lvlJc w:val="left"/>
+      <w:pPr>
+        <w:ind w:left="4320" w:hanging="360"/>
+      </w:pPr>
+      <w:rPr>
+        <w:rFonts w:ascii="Courier New" w:hAnsi="Courier New" w:cs="Courier New" w:hint="default"/>
+      </w:rPr>
+    </w:lvl>
+    <w:lvl w:ilvl="5" w:tplc="04090005" w:tentative="1">
+      <w:start w:val="1"/>
+      <w:numFmt w:val="bullet"/>
+      <w:lvlText w:val=""/>
+      <w:lvlJc w:val="left"/>
+      <w:pPr>
+        <w:ind w:left="5040" w:hanging="360"/>
+      </w:pPr>
+      <w:rPr>
+        <w:rFonts w:ascii="Wingdings" w:hAnsi="Wingdings" w:hint="default"/>
+      </w:rPr>
+    </w:lvl>
+    <w:lvl w:ilvl="6" w:tplc="04090001" w:tentative="1">
+      <w:start w:val="1"/>
+      <w:numFmt w:val="bullet"/>
+      <w:lvlText w:val=""/>
+      <w:lvlJc w:val="left"/>
+      <w:pPr>
+        <w:ind w:left="5760" w:hanging="360"/>
+      </w:pPr>
+      <w:rPr>
+        <w:rFonts w:ascii="Symbol" w:hAnsi="Symbol" w:hint="default"/>
+      </w:rPr>
+    </w:lvl>
+    <w:lvl w:ilvl="7" w:tplc="04090003" w:tentative="1">
+      <w:start w:val="1"/>
+      <w:numFmt w:val="bullet"/>
+      <w:lvlText w:val="o"/>
+      <w:lvlJc w:val="left"/>
+      <w:pPr>
+        <w:ind w:left="6480" w:hanging="360"/>
+      </w:pPr>
+      <w:rPr>
+        <w:rFonts w:ascii="Courier New" w:hAnsi="Courier New" w:cs="Courier New" w:hint="default"/>
+      </w:rPr>
+    </w:lvl>
+    <w:lvl w:ilvl="8" w:tplc="04090005" w:tentative="1">
+      <w:start w:val="1"/>
+      <w:numFmt w:val="bullet"/>
+      <w:lvlText w:val=""/>
+      <w:lvlJc w:val="left"/>
+      <w:pPr>
+        <w:ind w:left="7200" w:hanging="360"/>
+      </w:pPr>
+      <w:rPr>
+        <w:rFonts w:ascii="Wingdings" w:hAnsi="Wingdings" w:hint="default"/>
+      </w:rPr>
+    </w:lvl>
+  </w:abstractNum>
+  <w:abstractNum w:abstractNumId="14" w15:restartNumberingAfterBreak="0">
     <w:nsid w:val="4D201332"/>
     <w:multiLevelType w:val="hybridMultilevel"/>
     <w:tmpl w:val="17580994"/>
@@ -3425,7 +3806,7 @@
       </w:rPr>
     </w:lvl>
   </w:abstractNum>
-  <w:abstractNum w:abstractNumId="11" w15:restartNumberingAfterBreak="0">
+  <w:abstractNum w:abstractNumId="15" w15:restartNumberingAfterBreak="0">
     <w:nsid w:val="4FFF23AB"/>
     <w:multiLevelType w:val="hybridMultilevel"/>
     <w:tmpl w:val="404E571E"/>
@@ -3514,10 +3895,10 @@
       </w:pPr>
     </w:lvl>
   </w:abstractNum>
-  <w:abstractNum w:abstractNumId="12" w15:restartNumberingAfterBreak="0">
+  <w:abstractNum w:abstractNumId="16" w15:restartNumberingAfterBreak="0">
     <w:nsid w:val="532F7E68"/>
     <w:multiLevelType w:val="hybridMultilevel"/>
-    <w:tmpl w:val="51929E68"/>
+    <w:tmpl w:val="ED80F704"/>
     <w:lvl w:ilvl="0" w:tplc="0409000B">
       <w:start w:val="1"/>
       <w:numFmt w:val="bullet"/>
@@ -3627,7 +4008,7 @@
       </w:rPr>
     </w:lvl>
   </w:abstractNum>
-  <w:abstractNum w:abstractNumId="13" w15:restartNumberingAfterBreak="0">
+  <w:abstractNum w:abstractNumId="17" w15:restartNumberingAfterBreak="0">
     <w:nsid w:val="606A0519"/>
     <w:multiLevelType w:val="hybridMultilevel"/>
     <w:tmpl w:val="7F6491F6"/>
@@ -3740,7 +4121,7 @@
       </w:rPr>
     </w:lvl>
   </w:abstractNum>
-  <w:abstractNum w:abstractNumId="14" w15:restartNumberingAfterBreak="0">
+  <w:abstractNum w:abstractNumId="18" w15:restartNumberingAfterBreak="0">
     <w:nsid w:val="687359AA"/>
     <w:multiLevelType w:val="hybridMultilevel"/>
     <w:tmpl w:val="3BD23680"/>
@@ -3853,7 +4234,233 @@
       </w:rPr>
     </w:lvl>
   </w:abstractNum>
-  <w:abstractNum w:abstractNumId="15" w15:restartNumberingAfterBreak="0">
+  <w:abstractNum w:abstractNumId="19" w15:restartNumberingAfterBreak="0">
+    <w:nsid w:val="69633D56"/>
+    <w:multiLevelType w:val="hybridMultilevel"/>
+    <w:tmpl w:val="76528F5C"/>
+    <w:lvl w:ilvl="0" w:tplc="04090001">
+      <w:start w:val="1"/>
+      <w:numFmt w:val="bullet"/>
+      <w:lvlText w:val=""/>
+      <w:lvlJc w:val="left"/>
+      <w:pPr>
+        <w:ind w:left="720" w:hanging="360"/>
+      </w:pPr>
+      <w:rPr>
+        <w:rFonts w:ascii="Symbol" w:hAnsi="Symbol" w:hint="default"/>
+      </w:rPr>
+    </w:lvl>
+    <w:lvl w:ilvl="1" w:tplc="04090003" w:tentative="1">
+      <w:start w:val="1"/>
+      <w:numFmt w:val="bullet"/>
+      <w:lvlText w:val="o"/>
+      <w:lvlJc w:val="left"/>
+      <w:pPr>
+        <w:ind w:left="1440" w:hanging="360"/>
+      </w:pPr>
+      <w:rPr>
+        <w:rFonts w:ascii="Courier New" w:hAnsi="Courier New" w:cs="Courier New" w:hint="default"/>
+      </w:rPr>
+    </w:lvl>
+    <w:lvl w:ilvl="2" w:tplc="04090005" w:tentative="1">
+      <w:start w:val="1"/>
+      <w:numFmt w:val="bullet"/>
+      <w:lvlText w:val=""/>
+      <w:lvlJc w:val="left"/>
+      <w:pPr>
+        <w:ind w:left="2160" w:hanging="360"/>
+      </w:pPr>
+      <w:rPr>
+        <w:rFonts w:ascii="Wingdings" w:hAnsi="Wingdings" w:hint="default"/>
+      </w:rPr>
+    </w:lvl>
+    <w:lvl w:ilvl="3" w:tplc="04090001" w:tentative="1">
+      <w:start w:val="1"/>
+      <w:numFmt w:val="bullet"/>
+      <w:lvlText w:val=""/>
+      <w:lvlJc w:val="left"/>
+      <w:pPr>
+        <w:ind w:left="2880" w:hanging="360"/>
+      </w:pPr>
+      <w:rPr>
+        <w:rFonts w:ascii="Symbol" w:hAnsi="Symbol" w:hint="default"/>
+      </w:rPr>
+    </w:lvl>
+    <w:lvl w:ilvl="4" w:tplc="04090003" w:tentative="1">
+      <w:start w:val="1"/>
+      <w:numFmt w:val="bullet"/>
+      <w:lvlText w:val="o"/>
+      <w:lvlJc w:val="left"/>
+      <w:pPr>
+        <w:ind w:left="3600" w:hanging="360"/>
+      </w:pPr>
+      <w:rPr>
+        <w:rFonts w:ascii="Courier New" w:hAnsi="Courier New" w:cs="Courier New" w:hint="default"/>
+      </w:rPr>
+    </w:lvl>
+    <w:lvl w:ilvl="5" w:tplc="04090005" w:tentative="1">
+      <w:start w:val="1"/>
+      <w:numFmt w:val="bullet"/>
+      <w:lvlText w:val=""/>
+      <w:lvlJc w:val="left"/>
+      <w:pPr>
+        <w:ind w:left="4320" w:hanging="360"/>
+      </w:pPr>
+      <w:rPr>
+        <w:rFonts w:ascii="Wingdings" w:hAnsi="Wingdings" w:hint="default"/>
+      </w:rPr>
+    </w:lvl>
+    <w:lvl w:ilvl="6" w:tplc="04090001" w:tentative="1">
+      <w:start w:val="1"/>
+      <w:numFmt w:val="bullet"/>
+      <w:lvlText w:val=""/>
+      <w:lvlJc w:val="left"/>
+      <w:pPr>
+        <w:ind w:left="5040" w:hanging="360"/>
+      </w:pPr>
+      <w:rPr>
+        <w:rFonts w:ascii="Symbol" w:hAnsi="Symbol" w:hint="default"/>
+      </w:rPr>
+    </w:lvl>
+    <w:lvl w:ilvl="7" w:tplc="04090003" w:tentative="1">
+      <w:start w:val="1"/>
+      <w:numFmt w:val="bullet"/>
+      <w:lvlText w:val="o"/>
+      <w:lvlJc w:val="left"/>
+      <w:pPr>
+        <w:ind w:left="5760" w:hanging="360"/>
+      </w:pPr>
+      <w:rPr>
+        <w:rFonts w:ascii="Courier New" w:hAnsi="Courier New" w:cs="Courier New" w:hint="default"/>
+      </w:rPr>
+    </w:lvl>
+    <w:lvl w:ilvl="8" w:tplc="04090005" w:tentative="1">
+      <w:start w:val="1"/>
+      <w:numFmt w:val="bullet"/>
+      <w:lvlText w:val=""/>
+      <w:lvlJc w:val="left"/>
+      <w:pPr>
+        <w:ind w:left="6480" w:hanging="360"/>
+      </w:pPr>
+      <w:rPr>
+        <w:rFonts w:ascii="Wingdings" w:hAnsi="Wingdings" w:hint="default"/>
+      </w:rPr>
+    </w:lvl>
+  </w:abstractNum>
+  <w:abstractNum w:abstractNumId="20" w15:restartNumberingAfterBreak="0">
+    <w:nsid w:val="6CA37885"/>
+    <w:multiLevelType w:val="hybridMultilevel"/>
+    <w:tmpl w:val="BDD413B6"/>
+    <w:lvl w:ilvl="0" w:tplc="04090001">
+      <w:start w:val="1"/>
+      <w:numFmt w:val="bullet"/>
+      <w:lvlText w:val=""/>
+      <w:lvlJc w:val="left"/>
+      <w:pPr>
+        <w:ind w:left="1080" w:hanging="360"/>
+      </w:pPr>
+      <w:rPr>
+        <w:rFonts w:ascii="Symbol" w:hAnsi="Symbol" w:hint="default"/>
+      </w:rPr>
+    </w:lvl>
+    <w:lvl w:ilvl="1" w:tplc="04090003" w:tentative="1">
+      <w:start w:val="1"/>
+      <w:numFmt w:val="bullet"/>
+      <w:lvlText w:val="o"/>
+      <w:lvlJc w:val="left"/>
+      <w:pPr>
+        <w:ind w:left="1800" w:hanging="360"/>
+      </w:pPr>
+      <w:rPr>
+        <w:rFonts w:ascii="Courier New" w:hAnsi="Courier New" w:cs="Courier New" w:hint="default"/>
+      </w:rPr>
+    </w:lvl>
+    <w:lvl w:ilvl="2" w:tplc="04090005" w:tentative="1">
+      <w:start w:val="1"/>
+      <w:numFmt w:val="bullet"/>
+      <w:lvlText w:val=""/>
+      <w:lvlJc w:val="left"/>
+      <w:pPr>
+        <w:ind w:left="2520" w:hanging="360"/>
+      </w:pPr>
+      <w:rPr>
+        <w:rFonts w:ascii="Wingdings" w:hAnsi="Wingdings" w:hint="default"/>
+      </w:rPr>
+    </w:lvl>
+    <w:lvl w:ilvl="3" w:tplc="04090001" w:tentative="1">
+      <w:start w:val="1"/>
+      <w:numFmt w:val="bullet"/>
+      <w:lvlText w:val=""/>
+      <w:lvlJc w:val="left"/>
+      <w:pPr>
+        <w:ind w:left="3240" w:hanging="360"/>
+      </w:pPr>
+      <w:rPr>
+        <w:rFonts w:ascii="Symbol" w:hAnsi="Symbol" w:hint="default"/>
+      </w:rPr>
+    </w:lvl>
+    <w:lvl w:ilvl="4" w:tplc="04090003" w:tentative="1">
+      <w:start w:val="1"/>
+      <w:numFmt w:val="bullet"/>
+      <w:lvlText w:val="o"/>
+      <w:lvlJc w:val="left"/>
+      <w:pPr>
+        <w:ind w:left="3960" w:hanging="360"/>
+      </w:pPr>
+      <w:rPr>
+        <w:rFonts w:ascii="Courier New" w:hAnsi="Courier New" w:cs="Courier New" w:hint="default"/>
+      </w:rPr>
+    </w:lvl>
+    <w:lvl w:ilvl="5" w:tplc="04090005" w:tentative="1">
+      <w:start w:val="1"/>
+      <w:numFmt w:val="bullet"/>
+      <w:lvlText w:val=""/>
+      <w:lvlJc w:val="left"/>
+      <w:pPr>
+        <w:ind w:left="4680" w:hanging="360"/>
+      </w:pPr>
+      <w:rPr>
+        <w:rFonts w:ascii="Wingdings" w:hAnsi="Wingdings" w:hint="default"/>
+      </w:rPr>
+    </w:lvl>
+    <w:lvl w:ilvl="6" w:tplc="04090001" w:tentative="1">
+      <w:start w:val="1"/>
+      <w:numFmt w:val="bullet"/>
+      <w:lvlText w:val=""/>
+      <w:lvlJc w:val="left"/>
+      <w:pPr>
+        <w:ind w:left="5400" w:hanging="360"/>
+      </w:pPr>
+      <w:rPr>
+        <w:rFonts w:ascii="Symbol" w:hAnsi="Symbol" w:hint="default"/>
+      </w:rPr>
+    </w:lvl>
+    <w:lvl w:ilvl="7" w:tplc="04090003" w:tentative="1">
+      <w:start w:val="1"/>
+      <w:numFmt w:val="bullet"/>
+      <w:lvlText w:val="o"/>
+      <w:lvlJc w:val="left"/>
+      <w:pPr>
+        <w:ind w:left="6120" w:hanging="360"/>
+      </w:pPr>
+      <w:rPr>
+        <w:rFonts w:ascii="Courier New" w:hAnsi="Courier New" w:cs="Courier New" w:hint="default"/>
+      </w:rPr>
+    </w:lvl>
+    <w:lvl w:ilvl="8" w:tplc="04090005" w:tentative="1">
+      <w:start w:val="1"/>
+      <w:numFmt w:val="bullet"/>
+      <w:lvlText w:val=""/>
+      <w:lvlJc w:val="left"/>
+      <w:pPr>
+        <w:ind w:left="6840" w:hanging="360"/>
+      </w:pPr>
+      <w:rPr>
+        <w:rFonts w:ascii="Wingdings" w:hAnsi="Wingdings" w:hint="default"/>
+      </w:rPr>
+    </w:lvl>
+  </w:abstractNum>
+  <w:abstractNum w:abstractNumId="21" w15:restartNumberingAfterBreak="0">
     <w:nsid w:val="6DF2325D"/>
     <w:multiLevelType w:val="multilevel"/>
     <w:tmpl w:val="996A2352"/>
@@ -3966,7 +4573,156 @@
       </w:pPr>
     </w:lvl>
   </w:abstractNum>
-  <w:abstractNum w:abstractNumId="16" w15:restartNumberingAfterBreak="0">
+  <w:abstractNum w:abstractNumId="22" w15:restartNumberingAfterBreak="0">
+    <w:nsid w:val="7A1019DA"/>
+    <w:multiLevelType w:val="multilevel"/>
+    <w:tmpl w:val="CC7642A4"/>
+    <w:lvl w:ilvl="0">
+      <w:start w:val="1"/>
+      <w:numFmt w:val="bullet"/>
+      <w:lvlText w:val=""/>
+      <w:lvlJc w:val="left"/>
+      <w:pPr>
+        <w:tabs>
+          <w:tab w:val="num" w:pos="720"/>
+        </w:tabs>
+        <w:ind w:left="720" w:hanging="360"/>
+      </w:pPr>
+      <w:rPr>
+        <w:rFonts w:ascii="Symbol" w:hAnsi="Symbol" w:hint="default"/>
+        <w:sz w:val="20"/>
+      </w:rPr>
+    </w:lvl>
+    <w:lvl w:ilvl="1" w:tentative="1">
+      <w:start w:val="1"/>
+      <w:numFmt w:val="bullet"/>
+      <w:lvlText w:val="o"/>
+      <w:lvlJc w:val="left"/>
+      <w:pPr>
+        <w:tabs>
+          <w:tab w:val="num" w:pos="1440"/>
+        </w:tabs>
+        <w:ind w:left="1440" w:hanging="360"/>
+      </w:pPr>
+      <w:rPr>
+        <w:rFonts w:ascii="Courier New" w:hAnsi="Courier New" w:hint="default"/>
+        <w:sz w:val="20"/>
+      </w:rPr>
+    </w:lvl>
+    <w:lvl w:ilvl="2" w:tentative="1">
+      <w:start w:val="1"/>
+      <w:numFmt w:val="bullet"/>
+      <w:lvlText w:val=""/>
+      <w:lvlJc w:val="left"/>
+      <w:pPr>
+        <w:tabs>
+          <w:tab w:val="num" w:pos="2160"/>
+        </w:tabs>
+        <w:ind w:left="2160" w:hanging="360"/>
+      </w:pPr>
+      <w:rPr>
+        <w:rFonts w:ascii="Wingdings" w:hAnsi="Wingdings" w:hint="default"/>
+        <w:sz w:val="20"/>
+      </w:rPr>
+    </w:lvl>
+    <w:lvl w:ilvl="3" w:tentative="1">
+      <w:start w:val="1"/>
+      <w:numFmt w:val="bullet"/>
+      <w:lvlText w:val=""/>
+      <w:lvlJc w:val="left"/>
+      <w:pPr>
+        <w:tabs>
+          <w:tab w:val="num" w:pos="2880"/>
+        </w:tabs>
+        <w:ind w:left="2880" w:hanging="360"/>
+      </w:pPr>
+      <w:rPr>
+        <w:rFonts w:ascii="Wingdings" w:hAnsi="Wingdings" w:hint="default"/>
+        <w:sz w:val="20"/>
+      </w:rPr>
+    </w:lvl>
+    <w:lvl w:ilvl="4" w:tentative="1">
+      <w:start w:val="1"/>
+      <w:numFmt w:val="bullet"/>
+      <w:lvlText w:val=""/>
+      <w:lvlJc w:val="left"/>
+      <w:pPr>
+        <w:tabs>
+          <w:tab w:val="num" w:pos="3600"/>
+        </w:tabs>
+        <w:ind w:left="3600" w:hanging="360"/>
+      </w:pPr>
+      <w:rPr>
+        <w:rFonts w:ascii="Wingdings" w:hAnsi="Wingdings" w:hint="default"/>
+        <w:sz w:val="20"/>
+      </w:rPr>
+    </w:lvl>
+    <w:lvl w:ilvl="5" w:tentative="1">
+      <w:start w:val="1"/>
+      <w:numFmt w:val="bullet"/>
+      <w:lvlText w:val=""/>
+      <w:lvlJc w:val="left"/>
+      <w:pPr>
+        <w:tabs>
+          <w:tab w:val="num" w:pos="4320"/>
+        </w:tabs>
+        <w:ind w:left="4320" w:hanging="360"/>
+      </w:pPr>
+      <w:rPr>
+        <w:rFonts w:ascii="Wingdings" w:hAnsi="Wingdings" w:hint="default"/>
+        <w:sz w:val="20"/>
+      </w:rPr>
+    </w:lvl>
+    <w:lvl w:ilvl="6" w:tentative="1">
+      <w:start w:val="1"/>
+      <w:numFmt w:val="bullet"/>
+      <w:lvlText w:val=""/>
+      <w:lvlJc w:val="left"/>
+      <w:pPr>
+        <w:tabs>
+          <w:tab w:val="num" w:pos="5040"/>
+        </w:tabs>
+        <w:ind w:left="5040" w:hanging="360"/>
+      </w:pPr>
+      <w:rPr>
+        <w:rFonts w:ascii="Wingdings" w:hAnsi="Wingdings" w:hint="default"/>
+        <w:sz w:val="20"/>
+      </w:rPr>
+    </w:lvl>
+    <w:lvl w:ilvl="7" w:tentative="1">
+      <w:start w:val="1"/>
+      <w:numFmt w:val="bullet"/>
+      <w:lvlText w:val=""/>
+      <w:lvlJc w:val="left"/>
+      <w:pPr>
+        <w:tabs>
+          <w:tab w:val="num" w:pos="5760"/>
+        </w:tabs>
+        <w:ind w:left="5760" w:hanging="360"/>
+      </w:pPr>
+      <w:rPr>
+        <w:rFonts w:ascii="Wingdings" w:hAnsi="Wingdings" w:hint="default"/>
+        <w:sz w:val="20"/>
+      </w:rPr>
+    </w:lvl>
+    <w:lvl w:ilvl="8" w:tentative="1">
+      <w:start w:val="1"/>
+      <w:numFmt w:val="bullet"/>
+      <w:lvlText w:val=""/>
+      <w:lvlJc w:val="left"/>
+      <w:pPr>
+        <w:tabs>
+          <w:tab w:val="num" w:pos="6480"/>
+        </w:tabs>
+        <w:ind w:left="6480" w:hanging="360"/>
+      </w:pPr>
+      <w:rPr>
+        <w:rFonts w:ascii="Wingdings" w:hAnsi="Wingdings" w:hint="default"/>
+        <w:sz w:val="20"/>
+      </w:rPr>
+    </w:lvl>
+  </w:abstractNum>
+  <w:abstractNum w:abstractNumId="23" w15:restartNumberingAfterBreak="0">
     <w:nsid w:val="7A5D1F9A"/>
     <w:multiLevelType w:val="hybridMultilevel"/>
     <w:tmpl w:val="1A801D90"/>
@@ -4080,7 +4836,7 @@
     </w:lvl>
   </w:abstractNum>
   <w:num w:numId="1" w16cid:durableId="1348287249">
-    <w:abstractNumId w:val="9"/>
+    <w:abstractNumId w:val="11"/>
   </w:num>
   <w:num w:numId="2" w16cid:durableId="1015571345">
     <w:abstractNumId w:val="1"/>
@@ -4089,37 +4845,37 @@
     <w:abstractNumId w:val="6"/>
   </w:num>
   <w:num w:numId="4" w16cid:durableId="1711568565">
-    <w:abstractNumId w:val="12"/>
+    <w:abstractNumId w:val="16"/>
   </w:num>
   <w:num w:numId="5" w16cid:durableId="1899395105">
-    <w:abstractNumId w:val="13"/>
+    <w:abstractNumId w:val="17"/>
   </w:num>
   <w:num w:numId="6" w16cid:durableId="159276896">
     <w:abstractNumId w:val="7"/>
   </w:num>
   <w:num w:numId="7" w16cid:durableId="984968254">
-    <w:abstractNumId w:val="10"/>
+    <w:abstractNumId w:val="14"/>
   </w:num>
   <w:num w:numId="8" w16cid:durableId="885214655">
-    <w:abstractNumId w:val="14"/>
+    <w:abstractNumId w:val="18"/>
   </w:num>
   <w:num w:numId="9" w16cid:durableId="909198030">
     <w:abstractNumId w:val="4"/>
   </w:num>
   <w:num w:numId="10" w16cid:durableId="1399936180">
-    <w:abstractNumId w:val="8"/>
+    <w:abstractNumId w:val="9"/>
   </w:num>
   <w:num w:numId="11" w16cid:durableId="1579755105">
     <w:abstractNumId w:val="2"/>
   </w:num>
   <w:num w:numId="12" w16cid:durableId="1015184282">
-    <w:abstractNumId w:val="11"/>
+    <w:abstractNumId w:val="15"/>
   </w:num>
   <w:num w:numId="13" w16cid:durableId="543099871">
     <w:abstractNumId w:val="3"/>
   </w:num>
   <w:num w:numId="14" w16cid:durableId="127285698">
-    <w:abstractNumId w:val="16"/>
+    <w:abstractNumId w:val="23"/>
   </w:num>
   <w:num w:numId="15" w16cid:durableId="740295239">
     <w:abstractNumId w:val="5"/>
@@ -4128,13 +4884,43 @@
     <w:abstractNumId w:val="0"/>
   </w:num>
   <w:num w:numId="17" w16cid:durableId="1044477360">
-    <w:abstractNumId w:val="15"/>
+    <w:abstractNumId w:val="21"/>
+  </w:num>
+  <w:num w:numId="18" w16cid:durableId="635794171">
+    <w:abstractNumId w:val="12"/>
+    <w:lvlOverride w:ilvl="0"/>
+    <w:lvlOverride w:ilvl="1"/>
+    <w:lvlOverride w:ilvl="2"/>
+    <w:lvlOverride w:ilvl="3"/>
+    <w:lvlOverride w:ilvl="4"/>
+    <w:lvlOverride w:ilvl="5"/>
+    <w:lvlOverride w:ilvl="6"/>
+    <w:lvlOverride w:ilvl="7"/>
+    <w:lvlOverride w:ilvl="8"/>
+  </w:num>
+  <w:num w:numId="19" w16cid:durableId="747456678">
+    <w:abstractNumId w:val="13"/>
+  </w:num>
+  <w:num w:numId="20" w16cid:durableId="1664817132">
+    <w:abstractNumId w:val="20"/>
+  </w:num>
+  <w:num w:numId="21" w16cid:durableId="637495981">
+    <w:abstractNumId w:val="8"/>
+  </w:num>
+  <w:num w:numId="22" w16cid:durableId="84738427">
+    <w:abstractNumId w:val="19"/>
+  </w:num>
+  <w:num w:numId="23" w16cid:durableId="1251306157">
+    <w:abstractNumId w:val="10"/>
+  </w:num>
+  <w:num w:numId="24" w16cid:durableId="1890265267">
+    <w:abstractNumId w:val="22"/>
   </w:num>
 </w:numbering>
 </file>
 
 <file path=word/styles.xml><?xml version="1.0" encoding="utf-8"?>
-<w:styles xmlns:mc="http://schemas.openxmlformats.org/markup-compatibility/2006" xmlns:r="http://schemas.openxmlformats.org/officeDocument/2006/relationships" xmlns:w="http://schemas.openxmlformats.org/wordprocessingml/2006/main" xmlns:w14="http://schemas.microsoft.com/office/word/2010/wordml" xmlns:w15="http://schemas.microsoft.com/office/word/2012/wordml" xmlns:w16cex="http://schemas.microsoft.com/office/word/2018/wordml/cex" xmlns:w16cid="http://schemas.microsoft.com/office/word/2016/wordml/cid" xmlns:w16="http://schemas.microsoft.com/office/word/2018/wordml" xmlns:w16sdtdh="http://schemas.microsoft.com/office/word/2020/wordml/sdtdatahash" xmlns:w16se="http://schemas.microsoft.com/office/word/2015/wordml/symex" mc:Ignorable="w14 w15 w16se w16cid w16 w16cex w16sdtdh">
+<w:styles xmlns:mc="http://schemas.openxmlformats.org/markup-compatibility/2006" xmlns:r="http://schemas.openxmlformats.org/officeDocument/2006/relationships" xmlns:w="http://schemas.openxmlformats.org/wordprocessingml/2006/main" xmlns:w14="http://schemas.microsoft.com/office/word/2010/wordml" xmlns:w15="http://schemas.microsoft.com/office/word/2012/wordml" xmlns:w16cex="http://schemas.microsoft.com/office/word/2018/wordml/cex" xmlns:w16cid="http://schemas.microsoft.com/office/word/2016/wordml/cid" xmlns:w16="http://schemas.microsoft.com/office/word/2018/wordml" xmlns:w16du="http://schemas.microsoft.com/office/word/2023/wordml/word16du" xmlns:w16sdtdh="http://schemas.microsoft.com/office/word/2020/wordml/sdtdatahash" xmlns:w16sdtfl="http://schemas.microsoft.com/office/word/2024/wordml/sdtformatlock" xmlns:w16se="http://schemas.microsoft.com/office/word/2015/wordml/symex" mc:Ignorable="w14 w15 w16se w16cid w16 w16cex w16sdtdh w16sdtfl w16du">
   <w:docDefaults>
     <w:rPrDefault>
       <w:rPr>
@@ -4332,7 +5118,7 @@
     <w:lsdException w:name="Medium Shading 2 Accent 1" w:uiPriority="64"/>
     <w:lsdException w:name="Medium List 1 Accent 1" w:uiPriority="65"/>
     <w:lsdException w:name="Revision" w:semiHidden="1"/>
-    <w:lsdException w:name="List Paragraph" w:uiPriority="34" w:qFormat="1"/>
+    <w:lsdException w:name="List Paragraph" w:uiPriority="0" w:qFormat="1"/>
     <w:lsdException w:name="Quote" w:uiPriority="29" w:qFormat="1"/>
     <w:lsdException w:name="Intense Quote" w:uiPriority="30" w:qFormat="1"/>
     <w:lsdException w:name="Medium List 2 Accent 1" w:uiPriority="66"/>
@@ -4736,7 +5522,6 @@
   <w:style w:type="character" w:default="1" w:styleId="DefaultParagraphFont">
     <w:name w:val="Default Paragraph Font"/>
     <w:uiPriority w:val="1"/>
-    <w:semiHidden/>
     <w:unhideWhenUsed/>
   </w:style>
   <w:style w:type="table" w:default="1" w:styleId="TableNormal">
@@ -4981,7 +5766,6 @@
   <w:style w:type="paragraph" w:styleId="ListParagraph">
     <w:name w:val="List Paragraph"/>
     <w:basedOn w:val="Normal"/>
-    <w:uiPriority w:val="34"/>
     <w:qFormat/>
     <w:rsid w:val="00E66A62"/>
     <w:pPr>
@@ -5376,4 +6160,16 @@
     </a:ext>
   </a:extLst>
 </a:theme>
+</file>
+
+<file path=customXml/item1.xml><?xml version="1.0" encoding="utf-8"?>
+<b:Sources xmlns:b="http://schemas.openxmlformats.org/officeDocument/2006/bibliography" xmlns="http://schemas.openxmlformats.org/officeDocument/2006/bibliography" SelectedStyle="\APASixthEditionOfficeOnline.xsl" StyleName="APA" Version="6"/>
+</file>
+
+<file path=customXml/itemProps1.xml><?xml version="1.0" encoding="utf-8"?>
+<ds:datastoreItem xmlns:ds="http://schemas.openxmlformats.org/officeDocument/2006/customXml" ds:itemID="{3DCBE504-C0C5-4F3C-9AF3-1E6BA2A66C7E}">
+  <ds:schemaRefs>
+    <ds:schemaRef ds:uri="http://schemas.openxmlformats.org/officeDocument/2006/bibliography"/>
+  </ds:schemaRefs>
+</ds:datastoreItem>
 </file>
</xml_diff>